<commit_message>
docs: update manual with real system screenshots, step-by-step 1-7 guides, TH Sarabun PSK 16pt, and straight linear flowcharts
</commit_message>
<xml_diff>
--- a/manual/student_user_manual.docx
+++ b/manual/student_user_manual.docx
@@ -9,10 +9,11 @@
       </w:pPr>
       <w:r>
         <w:rPr>
-          <w:rFonts w:ascii="Prompt" w:hAnsi="Prompt"/>
+          <w:rFonts w:ascii="TH Sarabun PSK" w:hAnsi="TH Sarabun PSK" w:cs="TH Sarabun PSK"/>
           <w:b/>
+          <w:i w:val="0"/>
           <w:color w:val="0D9488"/>
-          <w:sz w:val="28"/>
+          <w:sz w:val="36"/>
         </w:rPr>
         <w:t>คณะพยาบาลศาสตร์ มหาวิทยาลัย</w:t>
         <w:br/>
@@ -21,23 +22,35 @@
       </w:r>
       <w:r>
         <w:rPr>
-          <w:rFonts w:ascii="Prompt" w:hAnsi="Prompt"/>
+          <w:rFonts w:ascii="TH Sarabun PSK" w:hAnsi="TH Sarabun PSK" w:cs="TH Sarabun PSK"/>
           <w:b/>
+          <w:i w:val="0"/>
           <w:color w:val="0F766E"/>
           <w:sz w:val="52"/>
         </w:rPr>
-        <w:t>คู่มือการใช้งานระบบ</w:t>
-        <w:br/>
-        <w:t>ห้องปฏิบัติการพยาบาลศาสตร์</w:t>
+        <w:t>คู่มือการใช้งานระบบห้องปฏิบัติการพยาบาลศาสตร์</w:t>
         <w:br/>
       </w:r>
       <w:r>
         <w:rPr>
-          <w:rFonts w:ascii="Prompt" w:hAnsi="Prompt"/>
+          <w:rFonts w:ascii="TH Sarabun PSK" w:hAnsi="TH Sarabun PSK" w:cs="TH Sarabun PSK"/>
+          <w:b/>
+          <w:i w:val="0"/>
           <w:color w:val="0284C7"/>
-          <w:sz w:val="36"/>
+          <w:sz w:val="40"/>
         </w:rPr>
-        <w:t>สำหรับนิสิตพยาบาล (Student User Manual)</w:t>
+        <w:t>สำหรับนิสิตพยาบาลศาสตร์ (Student User Manual)</w:t>
+        <w:br/>
+      </w:r>
+      <w:r>
+        <w:rPr>
+          <w:rFonts w:ascii="TH Sarabun PSK" w:hAnsi="TH Sarabun PSK" w:cs="TH Sarabun PSK"/>
+          <w:b w:val="0"/>
+          <w:i/>
+          <w:color w:val="64748B"/>
+          <w:sz w:val="32"/>
+        </w:rPr>
+        <w:t>ฉบับภาพหน้าจอจากระบบจริง พร้อมขั้นตอน 1 2 3 4 อย่างละเอียด</w:t>
         <w:br/>
       </w:r>
     </w:p>
@@ -48,7 +61,11 @@
       </w:pPr>
       <w:r>
         <w:rPr>
+          <w:rFonts w:ascii="TH Sarabun PSK" w:hAnsi="TH Sarabun PSK" w:cs="TH Sarabun PSK"/>
+          <w:b w:val="0"/>
+          <w:i w:val="0"/>
           <w:color w:val="CCFBF1"/>
+          <w:sz w:val="28"/>
         </w:rPr>
         <w:t>____________________________________________________</w:t>
       </w:r>
@@ -59,12 +76,15 @@
       </w:pPr>
       <w:r>
         <w:rPr>
-          <w:color w:val="64748B"/>
-          <w:sz w:val="22"/>
+          <w:rFonts w:ascii="TH Sarabun PSK" w:hAnsi="TH Sarabun PSK" w:cs="TH Sarabun PSK"/>
+          <w:b w:val="0"/>
+          <w:i w:val="0"/>
+          <w:color w:val="475569"/>
+          <w:sz w:val="28"/>
         </w:rPr>
         <w:t>งานห้องปฏิบัติการและเทคโนโลยีการศึกษา คณะพยาบาลศาสตร์</w:t>
         <w:br/>
-        <w:t>ระบบ One-Stop Requisition • Patient Safety Lock • QR Check-in</w:t>
+        <w:t>ฟอนต์มาตรฐาน TH Sarabun PSK ขนาด 16 pt • ผังงานเส้นตรงมาตรฐาน ISO 5807</w:t>
         <w:br/>
         <w:t>ฉบับปรับปรุง กันยายน 2569</w:t>
       </w:r>
@@ -76,194 +96,224 @@
     </w:p>
     <w:p>
       <w:pPr>
-        <w:pStyle w:val="Heading1"/>
+        <w:spacing w:after="280"/>
       </w:pPr>
       <w:r>
         <w:rPr>
-          <w:rFonts w:ascii="Prompt" w:hAnsi="Prompt"/>
+          <w:rFonts w:ascii="TH Sarabun PSK" w:hAnsi="TH Sarabun PSK" w:cs="TH Sarabun PSK"/>
+          <w:b/>
+          <w:i w:val="0"/>
           <w:color w:val="0F766E"/>
+          <w:sz w:val="40"/>
         </w:rPr>
         <w:t>สารบัญ (Table of Contents)</w:t>
       </w:r>
     </w:p>
     <w:p>
       <w:pPr>
-        <w:spacing w:after="120"/>
+        <w:spacing w:after="80"/>
       </w:pPr>
       <w:r>
         <w:rPr>
-          <w:sz w:val="22"/>
+          <w:rFonts w:ascii="TH Sarabun PSK" w:hAnsi="TH Sarabun PSK" w:cs="TH Sarabun PSK"/>
+          <w:b w:val="0"/>
+          <w:i w:val="0"/>
+          <w:sz w:val="30"/>
         </w:rPr>
-        <w:t>บทนำและวัตถุประสงค์ของระบบ ......................................</w:t>
+        <w:t>บทที่ 1: การเข้าสู่ระบบ (Student Login) พร้อมขั้นตอน 1-2-3 ......</w:t>
       </w:r>
       <w:r>
         <w:rPr>
+          <w:rFonts w:ascii="TH Sarabun PSK" w:hAnsi="TH Sarabun PSK" w:cs="TH Sarabun PSK"/>
           <w:b/>
-          <w:sz w:val="22"/>
+          <w:i w:val="0"/>
+          <w:sz w:val="30"/>
         </w:rPr>
         <w:t xml:space="preserve"> หน้า 3</w:t>
       </w:r>
     </w:p>
     <w:p>
       <w:pPr>
-        <w:spacing w:after="120"/>
+        <w:spacing w:after="80"/>
       </w:pPr>
       <w:r>
         <w:rPr>
-          <w:sz w:val="22"/>
+          <w:rFonts w:ascii="TH Sarabun PSK" w:hAnsi="TH Sarabun PSK" w:cs="TH Sarabun PSK"/>
+          <w:b w:val="0"/>
+          <w:i w:val="0"/>
+          <w:sz w:val="30"/>
         </w:rPr>
-        <w:t>บทที่ 1: การเข้าสู่ระบบและการเตรียมความพร้อม ....................</w:t>
+        <w:t xml:space="preserve">บทที่ 2: ผังงานขั้นตอนการทำงานมาตรฐาน (Standard Flowcharts เส้นตรง) </w:t>
       </w:r>
       <w:r>
         <w:rPr>
+          <w:rFonts w:ascii="TH Sarabun PSK" w:hAnsi="TH Sarabun PSK" w:cs="TH Sarabun PSK"/>
           <w:b/>
-          <w:sz w:val="22"/>
+          <w:i w:val="0"/>
+          <w:sz w:val="30"/>
         </w:rPr>
         <w:t xml:space="preserve"> หน้า 4</w:t>
       </w:r>
     </w:p>
     <w:p>
       <w:pPr>
-        <w:spacing w:after="120"/>
+        <w:spacing w:after="80"/>
       </w:pPr>
       <w:r>
         <w:rPr>
-          <w:sz w:val="22"/>
+          <w:rFonts w:ascii="TH Sarabun PSK" w:hAnsi="TH Sarabun PSK" w:cs="TH Sarabun PSK"/>
+          <w:b w:val="0"/>
+          <w:i w:val="0"/>
+          <w:sz w:val="30"/>
         </w:rPr>
-        <w:t>บทที่ 2: ผังงานขั้นตอนการทำงานมาตรฐาน (Standard Flowcharts) .....</w:t>
+        <w:t xml:space="preserve">   - 2.1 ผังงานภาพรวมการใช้งานของนิสิต (Overall Student Lifecycle) </w:t>
       </w:r>
       <w:r>
         <w:rPr>
+          <w:rFonts w:ascii="TH Sarabun PSK" w:hAnsi="TH Sarabun PSK" w:cs="TH Sarabun PSK"/>
           <w:b/>
-          <w:sz w:val="22"/>
+          <w:i w:val="0"/>
+          <w:sz w:val="30"/>
         </w:rPr>
         <w:t xml:space="preserve"> หน้า 5</w:t>
       </w:r>
     </w:p>
     <w:p>
       <w:pPr>
-        <w:spacing w:after="120"/>
+        <w:spacing w:after="80"/>
       </w:pPr>
       <w:r>
         <w:rPr>
-          <w:sz w:val="22"/>
+          <w:rFonts w:ascii="TH Sarabun PSK" w:hAnsi="TH Sarabun PSK" w:cs="TH Sarabun PSK"/>
+          <w:b w:val="0"/>
+          <w:i w:val="0"/>
+          <w:sz w:val="30"/>
         </w:rPr>
-        <w:t xml:space="preserve">   - 2.1 ผังงานภาพรวมการใช้งานของนิสิต (Overall Student Lifecycle) </w:t>
+        <w:t xml:space="preserve">   - 2.2 ผังงานการยืม-เบิก One-Stop และระบบ Patient Safety Lock .</w:t>
       </w:r>
       <w:r>
         <w:rPr>
+          <w:rFonts w:ascii="TH Sarabun PSK" w:hAnsi="TH Sarabun PSK" w:cs="TH Sarabun PSK"/>
           <w:b/>
-          <w:sz w:val="22"/>
+          <w:i w:val="0"/>
+          <w:sz w:val="30"/>
         </w:rPr>
         <w:t xml:space="preserve"> หน้า 6</w:t>
       </w:r>
     </w:p>
     <w:p>
       <w:pPr>
-        <w:spacing w:after="120"/>
+        <w:spacing w:after="80"/>
       </w:pPr>
       <w:r>
         <w:rPr>
-          <w:sz w:val="22"/>
+          <w:rFonts w:ascii="TH Sarabun PSK" w:hAnsi="TH Sarabun PSK" w:cs="TH Sarabun PSK"/>
+          <w:b w:val="0"/>
+          <w:i w:val="0"/>
+          <w:sz w:val="30"/>
         </w:rPr>
-        <w:t xml:space="preserve">   - 2.2 ผังงานการยืม-เบิก One-Stop และระบบ Patient Safety Lock .</w:t>
+        <w:t xml:space="preserve">   - 2.3 ผังงานการจองห้องแล็บและ Check-in สแกนเข้าห้อง ..........</w:t>
       </w:r>
       <w:r>
         <w:rPr>
+          <w:rFonts w:ascii="TH Sarabun PSK" w:hAnsi="TH Sarabun PSK" w:cs="TH Sarabun PSK"/>
           <w:b/>
-          <w:sz w:val="22"/>
+          <w:i w:val="0"/>
+          <w:sz w:val="30"/>
         </w:rPr>
         <w:t xml:space="preserve"> หน้า 7</w:t>
       </w:r>
     </w:p>
     <w:p>
       <w:pPr>
-        <w:spacing w:after="120"/>
+        <w:spacing w:after="80"/>
       </w:pPr>
       <w:r>
         <w:rPr>
-          <w:sz w:val="22"/>
+          <w:rFonts w:ascii="TH Sarabun PSK" w:hAnsi="TH Sarabun PSK" w:cs="TH Sarabun PSK"/>
+          <w:b w:val="0"/>
+          <w:i w:val="0"/>
+          <w:sz w:val="30"/>
         </w:rPr>
-        <w:t xml:space="preserve">   - 2.3 ผังงานการจองห้องแล็บและระบบสแกน QR Code Check-in .......</w:t>
+        <w:t xml:space="preserve">บทที่ 3: ขั้นตอนการยืม-เบิก One-Stop จากระบบจริง (ชี้จุดที่ 1 ถึง 7) </w:t>
       </w:r>
       <w:r>
         <w:rPr>
+          <w:rFonts w:ascii="TH Sarabun PSK" w:hAnsi="TH Sarabun PSK" w:cs="TH Sarabun PSK"/>
           <w:b/>
-          <w:sz w:val="22"/>
+          <w:i w:val="0"/>
+          <w:sz w:val="30"/>
         </w:rPr>
         <w:t xml:space="preserve"> หน้า 8</w:t>
       </w:r>
     </w:p>
     <w:p>
       <w:pPr>
-        <w:spacing w:after="120"/>
+        <w:spacing w:after="80"/>
       </w:pPr>
       <w:r>
         <w:rPr>
-          <w:sz w:val="22"/>
-        </w:rPr>
-        <w:t xml:space="preserve">บทที่ 3: ขั้นตอนการยืม-คืนครุภัณฑ์ และเบิกพัสดุสิ้นเปลือง (One-Stop Requisition) </w:t>
-      </w:r>
-      <w:r>
-        <w:rPr>
-          <w:b/>
-          <w:sz w:val="22"/>
-        </w:rPr>
-        <w:t xml:space="preserve"> หน้า 9</w:t>
-      </w:r>
-    </w:p>
-    <w:p>
-      <w:pPr>
-        <w:spacing w:after="120"/>
-      </w:pPr>
-      <w:r>
-        <w:rPr>
-          <w:sz w:val="22"/>
+          <w:rFonts w:ascii="TH Sarabun PSK" w:hAnsi="TH Sarabun PSK" w:cs="TH Sarabun PSK"/>
+          <w:b w:val="0"/>
+          <w:i w:val="0"/>
+          <w:sz w:val="30"/>
         </w:rPr>
         <w:t xml:space="preserve">บทที่ 4: การขอเบิกชุดฝึกปฏิบัติการสำเร็จรูป (Nursing Practice Kits) </w:t>
       </w:r>
       <w:r>
         <w:rPr>
+          <w:rFonts w:ascii="TH Sarabun PSK" w:hAnsi="TH Sarabun PSK" w:cs="TH Sarabun PSK"/>
           <w:b/>
-          <w:sz w:val="22"/>
+          <w:i w:val="0"/>
+          <w:sz w:val="30"/>
+        </w:rPr>
+        <w:t xml:space="preserve"> หน้า 10</w:t>
+      </w:r>
+    </w:p>
+    <w:p>
+      <w:pPr>
+        <w:spacing w:after="80"/>
+      </w:pPr>
+      <w:r>
+        <w:rPr>
+          <w:rFonts w:ascii="TH Sarabun PSK" w:hAnsi="TH Sarabun PSK" w:cs="TH Sarabun PSK"/>
+          <w:b w:val="0"/>
+          <w:i w:val="0"/>
+          <w:sz w:val="30"/>
+        </w:rPr>
+        <w:t xml:space="preserve">บทที่ 5: การขอเข้าฝึกปฏิบัติการด้วยตนเองและสแกน QR Code Check-in </w:t>
+      </w:r>
+      <w:r>
+        <w:rPr>
+          <w:rFonts w:ascii="TH Sarabun PSK" w:hAnsi="TH Sarabun PSK" w:cs="TH Sarabun PSK"/>
+          <w:b/>
+          <w:i w:val="0"/>
+          <w:sz w:val="30"/>
         </w:rPr>
         <w:t xml:space="preserve"> หน้า 11</w:t>
       </w:r>
     </w:p>
     <w:p>
       <w:pPr>
-        <w:spacing w:after="120"/>
+        <w:spacing w:after="80"/>
       </w:pPr>
       <w:r>
         <w:rPr>
-          <w:sz w:val="22"/>
+          <w:rFonts w:ascii="TH Sarabun PSK" w:hAnsi="TH Sarabun PSK" w:cs="TH Sarabun PSK"/>
+          <w:b w:val="0"/>
+          <w:i w:val="0"/>
+          <w:sz w:val="30"/>
         </w:rPr>
-        <w:t>บทที่ 5: การขอเข้าฝึกปฏิบัติการด้วยตนเองและสแกน QR Code .........</w:t>
+        <w:t xml:space="preserve">บทที่ 6: การส่งคืนอุปกรณ์และข้อพึงระวังความปลอดภัย (Safety Rules) </w:t>
       </w:r>
       <w:r>
         <w:rPr>
+          <w:rFonts w:ascii="TH Sarabun PSK" w:hAnsi="TH Sarabun PSK" w:cs="TH Sarabun PSK"/>
           <w:b/>
-          <w:sz w:val="22"/>
+          <w:i w:val="0"/>
+          <w:sz w:val="30"/>
         </w:rPr>
-        <w:t xml:space="preserve"> หน้า 12</w:t>
-      </w:r>
-    </w:p>
-    <w:p>
-      <w:pPr>
-        <w:spacing w:after="120"/>
-      </w:pPr>
-      <w:r>
-        <w:rPr>
-          <w:sz w:val="22"/>
-        </w:rPr>
-        <w:t xml:space="preserve">บทที่ 6: การส่งคืนอุปกรณ์และข้อปฏิบัติความปลอดภัย (Return Guidelines) </w:t>
-      </w:r>
-      <w:r>
-        <w:rPr>
-          <w:b/>
-          <w:sz w:val="22"/>
-        </w:rPr>
-        <w:t xml:space="preserve"> หน้า 14</w:t>
+        <w:t xml:space="preserve"> หน้า 13</w:t>
       </w:r>
     </w:p>
     <w:p>
@@ -272,97 +322,33 @@
       </w:r>
     </w:p>
     <w:p>
-      <w:pPr>
-        <w:pStyle w:val="Heading1"/>
-      </w:pPr>
       <w:r>
         <w:rPr>
-          <w:rFonts w:ascii="Prompt" w:hAnsi="Prompt"/>
+          <w:rFonts w:ascii="TH Sarabun PSK" w:hAnsi="TH Sarabun PSK" w:cs="TH Sarabun PSK"/>
+          <w:b/>
+          <w:i w:val="0"/>
           <w:color w:val="0F766E"/>
+          <w:sz w:val="40"/>
         </w:rPr>
-        <w:t>บทนำและวัตถุประสงค์ของระบบ</w:t>
-      </w:r>
-    </w:p>
-    <w:p>
-      <w:pPr>
-        <w:spacing w:after="200"/>
-      </w:pPr>
-      <w:r>
-        <w:t>ระบบบริหารจัดการห้องปฏิบัติการพยาบาลศาสตร์ (Smart Nursing Lab Management System) ได้รับการออกแบบและพัฒนาขึ้นเพื่อรองรับกระบวนการฝึกทักษะทางการพยาบาลของนิสิต โดยเน้นความสะดวก รวดเร็ว ถูกต้องตามหลักวิชาชีพ และมีระบบป้องกันความปลอดภัยทางการแพทย์อย่างเข้มงวด</w:t>
-      </w:r>
-    </w:p>
-    <w:tbl>
-      <w:tblPr>
-        <w:tblW w:type="auto" w:w="0"/>
-        <w:jc w:val="center"/>
-        <w:tblLook w:firstColumn="1" w:firstRow="1" w:lastColumn="0" w:lastRow="0" w:noHBand="0" w:noVBand="1" w:val="04A0"/>
-      </w:tblPr>
-      <w:tblGrid>
-        <w:gridCol w:w="9360"/>
-      </w:tblGrid>
-      <w:tr>
-        <w:tc>
-          <w:tcPr>
-            <w:tcW w:type="dxa" w:w="9360"/>
-            <w:shd w:fill="F0FDFA"/>
-            <w:tcMar>
-              <w:top w:w="140" w:type="dxa"/>
-              <w:bottom w:w="140" w:type="dxa"/>
-              <w:left w:w="200" w:type="dxa"/>
-              <w:right w:w="200" w:type="dxa"/>
-            </w:tcMar>
-          </w:tcPr>
-          <w:p>
-            <w:r>
-              <w:rPr>
-                <w:rFonts w:ascii="Prompt" w:hAnsi="Prompt"/>
-                <w:b/>
-                <w:color w:val="0F766E"/>
-              </w:rPr>
-              <w:t>💡 3 นวัตกรรมสำคัญสำหรับนิสิตในระบบนี้:</w:t>
-              <w:br/>
-            </w:r>
-            <w:r>
-              <w:rPr>
-                <w:sz w:val="21"/>
-              </w:rPr>
-              <w:t>1. One-Stop Requisition: รวมการขอยืมครุภัณฑ์และการเบิกเวชภัณฑ์ไว้ในฟอร์มเดียว สะดวก รวดเร็ว</w:t>
-              <w:br/>
-              <w:t>2. Patient Safety Lock: แยกวัตถุประสงค์การใช้งานระหว่างหุ่นจำลองกับคนจริงอย่างเด็ดขาด บล็อกล็อตหมดอายุ 100%</w:t>
-              <w:br/>
-              <w:t>3. Digital Practice Ticket: จองห้องแล็บฝึกซ้อมนอกเวลา พร้อมออกบัตรคิวเสมือนและ QR Code สแกนเข้าห้อง</w:t>
-            </w:r>
-          </w:p>
-        </w:tc>
-      </w:tr>
-    </w:tbl>
-    <w:p>
-      <w:r>
-        <w:br w:type="page"/>
-      </w:r>
-    </w:p>
-    <w:p>
-      <w:pPr>
-        <w:pStyle w:val="Heading1"/>
-      </w:pPr>
-      <w:r>
-        <w:rPr>
-          <w:rFonts w:ascii="Prompt" w:hAnsi="Prompt"/>
-          <w:color w:val="0F766E"/>
-        </w:rPr>
-        <w:t>บทที่ 1: การเข้าสู่ระบบและการเตรียมความพร้อม</w:t>
+        <w:t>บทที่ 1: การเข้าสู่ระบบ (Student Login)</w:t>
       </w:r>
     </w:p>
     <w:p>
       <w:r>
-        <w:t>นิสิตสามารถเข้าใช้งานระบบได้จากอุปกรณ์คอมพิวเตอร์ แท็บเล็ต หรือสมาร์ทโฟน โดยเข้าใช้งานผ่านเว็บเบราว์เซอร์ของมหาวิทยาลัยและล็อกอินด้วยรหัสนิสิต</w:t>
+        <w:rPr>
+          <w:rFonts w:ascii="TH Sarabun PSK" w:hAnsi="TH Sarabun PSK" w:cs="TH Sarabun PSK"/>
+          <w:b w:val="0"/>
+          <w:i w:val="0"/>
+          <w:sz w:val="32"/>
+        </w:rPr>
+        <w:t>นิสิตสามารถเข้าสู่ระบบผ่านเว็บเบราว์เซอร์ของมหาวิทยาลัยได้จากทุกอุปกรณ์ โดยกรอกข้อมูลตามลำดับขั้นตอนดังแสดงในรูปที่ 1.1:</w:t>
       </w:r>
     </w:p>
     <w:p>
       <w:r>
         <w:drawing>
           <wp:inline xmlns:a="http://schemas.openxmlformats.org/drawingml/2006/main" xmlns:pic="http://schemas.openxmlformats.org/drawingml/2006/picture">
-            <wp:extent cx="5120640" cy="3698240"/>
+            <wp:extent cx="5303520" cy="4051300"/>
             <wp:docPr id="1" name="Picture 1"/>
             <wp:cNvGraphicFramePr>
               <a:graphicFrameLocks noChangeAspect="1"/>
@@ -371,7 +357,7 @@
               <a:graphicData uri="http://schemas.openxmlformats.org/drawingml/2006/picture">
                 <pic:pic>
                   <pic:nvPicPr>
-                    <pic:cNvPr id="0" name="ui_mockup_login.png"/>
+                    <pic:cNvPr id="0" name="step_login_guide.png"/>
                     <pic:cNvPicPr/>
                   </pic:nvPicPr>
                   <pic:blipFill>
@@ -383,7 +369,7 @@
                   <pic:spPr>
                     <a:xfrm>
                       <a:off x="0" y="0"/>
-                      <a:ext cx="5120640" cy="3698240"/>
+                      <a:ext cx="5303520" cy="4051300"/>
                     </a:xfrm>
                     <a:prstGeom prst="rect"/>
                   </pic:spPr>
@@ -400,22 +386,86 @@
       </w:pPr>
       <w:r>
         <w:rPr>
+          <w:rFonts w:ascii="TH Sarabun PSK" w:hAnsi="TH Sarabun PSK" w:cs="TH Sarabun PSK"/>
+          <w:b w:val="0"/>
           <w:i/>
           <w:color w:val="64748B"/>
-          <w:sz w:val="19"/>
+          <w:sz w:val="28"/>
         </w:rPr>
-        <w:t>รูปที่ 1.1: หน้าจอเข้าสู่ระบบสำหรับนิสิตพยาบาล (Student Login)</w:t>
+        <w:t>รูปที่ 1.1: ภาพจากระบบจริง - ขั้นตอนการกรอกข้อมูลเข้าสู่ระบบ (ขั้นตอน 1 - 3)</w:t>
+      </w:r>
+    </w:p>
+    <w:p/>
+    <w:p>
+      <w:pPr>
+        <w:spacing w:after="80"/>
+      </w:pPr>
+      <w:r>
+        <w:rPr>
+          <w:rFonts w:ascii="TH Sarabun PSK" w:hAnsi="TH Sarabun PSK" w:cs="TH Sarabun PSK"/>
+          <w:b/>
+          <w:i w:val="0"/>
+          <w:color w:val="0F766E"/>
+          <w:sz w:val="32"/>
+        </w:rPr>
+        <w:t>• ขั้นตอนที่ 1 (กรอกรหัสนิสิต):</w:t>
+      </w:r>
+      <w:r>
+        <w:rPr>
+          <w:rFonts w:ascii="TH Sarabun PSK" w:hAnsi="TH Sarabun PSK" w:cs="TH Sarabun PSK"/>
+          <w:b w:val="0"/>
+          <w:i w:val="0"/>
+          <w:sz w:val="32"/>
+        </w:rPr>
+        <w:t xml:space="preserve"> กรอกรหัสนิสิต 10 หลัก (เช่น 6811700661) หรืออีเมลมหาวิทยาลัย</w:t>
       </w:r>
     </w:p>
     <w:p>
+      <w:pPr>
+        <w:spacing w:after="80"/>
+      </w:pPr>
       <w:r>
-        <w:t>ข้อมูลจำลองนิสิตสำหรับคู่มือฉบับนี้ (Student Persona):</w:t>
-        <w:br/>
-        <w:t>• ชื่อ-สกุล: น.ส. นภัสสร ใจดี</w:t>
-        <w:br/>
-        <w:t>• รหัสนิสิต: 66010023 (ชั้นปีที่ 2 หลักสูตรพยาบาลศาสตรบัณฑิต)</w:t>
-        <w:br/>
-        <w:t>• รายวิชาที่ศึกษา: NS201 การพยาบาลพื้นฐาน (อาจารย์ผู้รับผิดชอบ: ผศ.ดร.พิมพา สุขเกษม)</w:t>
+        <w:rPr>
+          <w:rFonts w:ascii="TH Sarabun PSK" w:hAnsi="TH Sarabun PSK" w:cs="TH Sarabun PSK"/>
+          <w:b/>
+          <w:i w:val="0"/>
+          <w:color w:val="0F766E"/>
+          <w:sz w:val="32"/>
+        </w:rPr>
+        <w:t>• ขั้นตอนที่ 2 (กรอกรหัสผ่าน):</w:t>
+      </w:r>
+      <w:r>
+        <w:rPr>
+          <w:rFonts w:ascii="TH Sarabun PSK" w:hAnsi="TH Sarabun PSK" w:cs="TH Sarabun PSK"/>
+          <w:b w:val="0"/>
+          <w:i w:val="0"/>
+          <w:sz w:val="32"/>
+        </w:rPr>
+        <w:t xml:space="preserve"> กรอกรหัสผ่านบัญชีผู้ใช้งานของนิสิต</w:t>
+      </w:r>
+    </w:p>
+    <w:p>
+      <w:pPr>
+        <w:spacing w:after="80"/>
+      </w:pPr>
+      <w:r>
+        <w:rPr>
+          <w:rFonts w:ascii="TH Sarabun PSK" w:hAnsi="TH Sarabun PSK" w:cs="TH Sarabun PSK"/>
+          <w:b/>
+          <w:i w:val="0"/>
+          <w:color w:val="0F766E"/>
+          <w:sz w:val="32"/>
+        </w:rPr>
+        <w:t>• ขั้นตอนที่ 3 (กดปุ่มเข้าสู่ระบบ):</w:t>
+      </w:r>
+      <w:r>
+        <w:rPr>
+          <w:rFonts w:ascii="TH Sarabun PSK" w:hAnsi="TH Sarabun PSK" w:cs="TH Sarabun PSK"/>
+          <w:b w:val="0"/>
+          <w:i w:val="0"/>
+          <w:sz w:val="32"/>
+        </w:rPr>
+        <w:t xml:space="preserve"> กดปุ่ม 'เข้าสู่ระบบ (Sign In)' เพื่อเข้าสู่หน้าจอหลักของนิสิต</w:t>
       </w:r>
     </w:p>
     <w:p>
@@ -424,20 +474,26 @@
       </w:r>
     </w:p>
     <w:p>
-      <w:pPr>
-        <w:pStyle w:val="Heading1"/>
-      </w:pPr>
       <w:r>
         <w:rPr>
-          <w:rFonts w:ascii="Prompt" w:hAnsi="Prompt"/>
+          <w:rFonts w:ascii="TH Sarabun PSK" w:hAnsi="TH Sarabun PSK" w:cs="TH Sarabun PSK"/>
+          <w:b/>
+          <w:i w:val="0"/>
           <w:color w:val="0F766E"/>
+          <w:sz w:val="40"/>
         </w:rPr>
         <w:t>บทที่ 2: ผังงานขั้นตอนการทำงานมาตรฐาน (Standard Flowcharts)</w:t>
       </w:r>
     </w:p>
     <w:p>
       <w:r>
-        <w:t>ผังงานในคู่มือฉบับนี้จัดทำขึ้นตามมาตรฐานสากล ISO 5807 / ANSI Information Processing โดยมีสัญลักษณ์และข้อกำหนดการใช้งานดังนี้:</w:t>
+        <w:rPr>
+          <w:rFonts w:ascii="TH Sarabun PSK" w:hAnsi="TH Sarabun PSK" w:cs="TH Sarabun PSK"/>
+          <w:b w:val="0"/>
+          <w:i w:val="0"/>
+          <w:sz w:val="32"/>
+        </w:rPr>
+        <w:t>ผังงานในระบบใช้มาตรฐานสากล ISO 5807 / ANSI โดยใช้เส้นเชื่อมโยงแบบตรง (Linear Flow) ไม่มีลูกศรโค้งไปมา เพื่อความชัดเจนและเป็นทางการในการนำไปปฏิบัติงานจริง:</w:t>
       </w:r>
     </w:p>
     <w:tbl>
@@ -460,8 +516,10 @@
           <w:p>
             <w:r>
               <w:rPr>
+                <w:rFonts w:ascii="TH Sarabun PSK" w:hAnsi="TH Sarabun PSK" w:cs="TH Sarabun PSK"/>
                 <w:b/>
-                <w:sz w:val="21"/>
+                <w:i w:val="0"/>
+                <w:sz w:val="28"/>
               </w:rPr>
               <w:t>สัญลักษณ์</w:t>
             </w:r>
@@ -475,8 +533,10 @@
           <w:p>
             <w:r>
               <w:rPr>
+                <w:rFonts w:ascii="TH Sarabun PSK" w:hAnsi="TH Sarabun PSK" w:cs="TH Sarabun PSK"/>
                 <w:b/>
-                <w:sz w:val="21"/>
+                <w:i w:val="0"/>
+                <w:sz w:val="28"/>
               </w:rPr>
               <w:t>ชื่อมาตรฐาน</w:t>
             </w:r>
@@ -490,8 +550,10 @@
           <w:p>
             <w:r>
               <w:rPr>
+                <w:rFonts w:ascii="TH Sarabun PSK" w:hAnsi="TH Sarabun PSK" w:cs="TH Sarabun PSK"/>
                 <w:b/>
-                <w:sz w:val="21"/>
+                <w:i w:val="0"/>
+                <w:sz w:val="28"/>
               </w:rPr>
               <w:t>ความหมายและการใช้งานในระบบ</w:t>
             </w:r>
@@ -503,18 +565,21 @@
           <w:tcPr>
             <w:tcW w:type="dxa" w:w="3120"/>
             <w:tcMar>
-              <w:top w:w="80" w:type="dxa"/>
-              <w:bottom w:w="80" w:type="dxa"/>
-              <w:left w:w="120" w:type="dxa"/>
-              <w:right w:w="120" w:type="dxa"/>
+              <w:top w:w="60" w:type="dxa"/>
+              <w:bottom w:w="60" w:type="dxa"/>
+              <w:left w:w="100" w:type="dxa"/>
+              <w:right w:w="100" w:type="dxa"/>
             </w:tcMar>
           </w:tcPr>
           <w:p>
             <w:r>
               <w:rPr>
-                <w:sz w:val="20"/>
+                <w:rFonts w:ascii="TH Sarabun PSK" w:hAnsi="TH Sarabun PSK" w:cs="TH Sarabun PSK"/>
+                <w:b w:val="0"/>
+                <w:i w:val="0"/>
+                <w:sz w:val="28"/>
               </w:rPr>
-              <w:t>Terminator (วงรี/แคปซูล)</w:t>
+              <w:t>🟢 วงรี/แคปซูล (Terminator)</w:t>
             </w:r>
           </w:p>
         </w:tc>
@@ -522,16 +587,19 @@
           <w:tcPr>
             <w:tcW w:type="dxa" w:w="3120"/>
             <w:tcMar>
-              <w:top w:w="80" w:type="dxa"/>
-              <w:bottom w:w="80" w:type="dxa"/>
-              <w:left w:w="120" w:type="dxa"/>
-              <w:right w:w="120" w:type="dxa"/>
+              <w:top w:w="60" w:type="dxa"/>
+              <w:bottom w:w="60" w:type="dxa"/>
+              <w:left w:w="100" w:type="dxa"/>
+              <w:right w:w="100" w:type="dxa"/>
             </w:tcMar>
           </w:tcPr>
           <w:p>
             <w:r>
               <w:rPr>
-                <w:sz w:val="20"/>
+                <w:rFonts w:ascii="TH Sarabun PSK" w:hAnsi="TH Sarabun PSK" w:cs="TH Sarabun PSK"/>
+                <w:b w:val="0"/>
+                <w:i w:val="0"/>
+                <w:sz w:val="28"/>
               </w:rPr>
               <w:t>จุดเริ่มต้น / จุดสิ้นสุด</w:t>
             </w:r>
@@ -541,18 +609,21 @@
           <w:tcPr>
             <w:tcW w:type="dxa" w:w="3120"/>
             <w:tcMar>
-              <w:top w:w="80" w:type="dxa"/>
-              <w:bottom w:w="80" w:type="dxa"/>
-              <w:left w:w="120" w:type="dxa"/>
-              <w:right w:w="120" w:type="dxa"/>
+              <w:top w:w="60" w:type="dxa"/>
+              <w:bottom w:w="60" w:type="dxa"/>
+              <w:left w:w="100" w:type="dxa"/>
+              <w:right w:w="100" w:type="dxa"/>
             </w:tcMar>
           </w:tcPr>
           <w:p>
             <w:r>
               <w:rPr>
-                <w:sz w:val="20"/>
+                <w:rFonts w:ascii="TH Sarabun PSK" w:hAnsi="TH Sarabun PSK" w:cs="TH Sarabun PSK"/>
+                <w:b w:val="0"/>
+                <w:i w:val="0"/>
+                <w:sz w:val="28"/>
               </w:rPr>
-              <w:t>ระบุจุดเริ่มต้นกระบวนการ หรือจุดเสร็จสิ้นขั้นตอนทั้งหมด</w:t>
+              <w:t>ระบุจุดเริ่มต้นหรือจุดสิ้นสุดของกระบวนการ</w:t>
             </w:r>
           </w:p>
         </w:tc>
@@ -562,18 +633,21 @@
           <w:tcPr>
             <w:tcW w:type="dxa" w:w="3120"/>
             <w:tcMar>
-              <w:top w:w="80" w:type="dxa"/>
-              <w:bottom w:w="80" w:type="dxa"/>
-              <w:left w:w="120" w:type="dxa"/>
-              <w:right w:w="120" w:type="dxa"/>
+              <w:top w:w="60" w:type="dxa"/>
+              <w:bottom w:w="60" w:type="dxa"/>
+              <w:left w:w="100" w:type="dxa"/>
+              <w:right w:w="100" w:type="dxa"/>
             </w:tcMar>
           </w:tcPr>
           <w:p>
             <w:r>
               <w:rPr>
-                <w:sz w:val="20"/>
+                <w:rFonts w:ascii="TH Sarabun PSK" w:hAnsi="TH Sarabun PSK" w:cs="TH Sarabun PSK"/>
+                <w:b w:val="0"/>
+                <w:i w:val="0"/>
+                <w:sz w:val="28"/>
               </w:rPr>
-              <w:t>Process (สี่เหลี่ยมผืนผ้า)</w:t>
+              <w:t>⬜ สี่เหลี่ยมผืนผ้า (Process)</w:t>
             </w:r>
           </w:p>
         </w:tc>
@@ -581,16 +655,19 @@
           <w:tcPr>
             <w:tcW w:type="dxa" w:w="3120"/>
             <w:tcMar>
-              <w:top w:w="80" w:type="dxa"/>
-              <w:bottom w:w="80" w:type="dxa"/>
-              <w:left w:w="120" w:type="dxa"/>
-              <w:right w:w="120" w:type="dxa"/>
+              <w:top w:w="60" w:type="dxa"/>
+              <w:bottom w:w="60" w:type="dxa"/>
+              <w:left w:w="100" w:type="dxa"/>
+              <w:right w:w="100" w:type="dxa"/>
             </w:tcMar>
           </w:tcPr>
           <w:p>
             <w:r>
               <w:rPr>
-                <w:sz w:val="20"/>
+                <w:rFonts w:ascii="TH Sarabun PSK" w:hAnsi="TH Sarabun PSK" w:cs="TH Sarabun PSK"/>
+                <w:b w:val="0"/>
+                <w:i w:val="0"/>
+                <w:sz w:val="28"/>
               </w:rPr>
               <w:t>ขั้นตอนการปฏิบัติงาน</w:t>
             </w:r>
@@ -600,18 +677,21 @@
           <w:tcPr>
             <w:tcW w:type="dxa" w:w="3120"/>
             <w:tcMar>
-              <w:top w:w="80" w:type="dxa"/>
-              <w:bottom w:w="80" w:type="dxa"/>
-              <w:left w:w="120" w:type="dxa"/>
-              <w:right w:w="120" w:type="dxa"/>
+              <w:top w:w="60" w:type="dxa"/>
+              <w:bottom w:w="60" w:type="dxa"/>
+              <w:left w:w="100" w:type="dxa"/>
+              <w:right w:w="100" w:type="dxa"/>
             </w:tcMar>
           </w:tcPr>
           <w:p>
             <w:r>
               <w:rPr>
-                <w:sz w:val="20"/>
+                <w:rFonts w:ascii="TH Sarabun PSK" w:hAnsi="TH Sarabun PSK" w:cs="TH Sarabun PSK"/>
+                <w:b w:val="0"/>
+                <w:i w:val="0"/>
+                <w:sz w:val="28"/>
               </w:rPr>
-              <w:t>การกระทำ เช่น กรอกข้อมูล, คำนวณสต็อก, จ่ายพัสดุ</w:t>
+              <w:t>การกระทำ เช่น บันทึกข้อมูล, ตรวจสอบสต็อก, จัดส่งพัสดุ</w:t>
             </w:r>
           </w:p>
         </w:tc>
@@ -621,18 +701,21 @@
           <w:tcPr>
             <w:tcW w:type="dxa" w:w="3120"/>
             <w:tcMar>
-              <w:top w:w="80" w:type="dxa"/>
-              <w:bottom w:w="80" w:type="dxa"/>
-              <w:left w:w="120" w:type="dxa"/>
-              <w:right w:w="120" w:type="dxa"/>
+              <w:top w:w="60" w:type="dxa"/>
+              <w:bottom w:w="60" w:type="dxa"/>
+              <w:left w:w="100" w:type="dxa"/>
+              <w:right w:w="100" w:type="dxa"/>
             </w:tcMar>
           </w:tcPr>
           <w:p>
             <w:r>
               <w:rPr>
-                <w:sz w:val="20"/>
+                <w:rFonts w:ascii="TH Sarabun PSK" w:hAnsi="TH Sarabun PSK" w:cs="TH Sarabun PSK"/>
+                <w:b w:val="0"/>
+                <w:i w:val="0"/>
+                <w:sz w:val="28"/>
               </w:rPr>
-              <w:t>Decision (ข้าวหลามตัด)</w:t>
+              <w:t>🔶 สี่เหลี่ยมข้าวหลามตัด (Decision)</w:t>
             </w:r>
           </w:p>
         </w:tc>
@@ -640,16 +723,19 @@
           <w:tcPr>
             <w:tcW w:type="dxa" w:w="3120"/>
             <w:tcMar>
-              <w:top w:w="80" w:type="dxa"/>
-              <w:bottom w:w="80" w:type="dxa"/>
-              <w:left w:w="120" w:type="dxa"/>
-              <w:right w:w="120" w:type="dxa"/>
+              <w:top w:w="60" w:type="dxa"/>
+              <w:bottom w:w="60" w:type="dxa"/>
+              <w:left w:w="100" w:type="dxa"/>
+              <w:right w:w="100" w:type="dxa"/>
             </w:tcMar>
           </w:tcPr>
           <w:p>
             <w:r>
               <w:rPr>
-                <w:sz w:val="20"/>
+                <w:rFonts w:ascii="TH Sarabun PSK" w:hAnsi="TH Sarabun PSK" w:cs="TH Sarabun PSK"/>
+                <w:b w:val="0"/>
+                <w:i w:val="0"/>
+                <w:sz w:val="28"/>
               </w:rPr>
               <w:t>จุดตัดสินใจเงื่อนไข</w:t>
             </w:r>
@@ -659,18 +745,21 @@
           <w:tcPr>
             <w:tcW w:type="dxa" w:w="3120"/>
             <w:tcMar>
-              <w:top w:w="80" w:type="dxa"/>
-              <w:bottom w:w="80" w:type="dxa"/>
-              <w:left w:w="120" w:type="dxa"/>
-              <w:right w:w="120" w:type="dxa"/>
+              <w:top w:w="60" w:type="dxa"/>
+              <w:bottom w:w="60" w:type="dxa"/>
+              <w:left w:w="100" w:type="dxa"/>
+              <w:right w:w="100" w:type="dxa"/>
             </w:tcMar>
           </w:tcPr>
           <w:p>
             <w:r>
               <w:rPr>
-                <w:sz w:val="20"/>
+                <w:rFonts w:ascii="TH Sarabun PSK" w:hAnsi="TH Sarabun PSK" w:cs="TH Sarabun PSK"/>
+                <w:b w:val="0"/>
+                <w:i w:val="0"/>
+                <w:sz w:val="28"/>
               </w:rPr>
-              <w:t>การตรวจสอบเงื่อนไข เช่น อนุมัติหรือไม่, วันหมดอายุผ่านหรือไม่</w:t>
+              <w:t>การตรวจสอบเงื่อนไข มีกิ่ง Yes / No ชัดเจน</w:t>
             </w:r>
           </w:p>
         </w:tc>
@@ -680,18 +769,21 @@
           <w:tcPr>
             <w:tcW w:type="dxa" w:w="3120"/>
             <w:tcMar>
-              <w:top w:w="80" w:type="dxa"/>
-              <w:bottom w:w="80" w:type="dxa"/>
-              <w:left w:w="120" w:type="dxa"/>
-              <w:right w:w="120" w:type="dxa"/>
+              <w:top w:w="60" w:type="dxa"/>
+              <w:bottom w:w="60" w:type="dxa"/>
+              <w:left w:w="100" w:type="dxa"/>
+              <w:right w:w="100" w:type="dxa"/>
             </w:tcMar>
           </w:tcPr>
           <w:p>
             <w:r>
               <w:rPr>
-                <w:sz w:val="20"/>
+                <w:rFonts w:ascii="TH Sarabun PSK" w:hAnsi="TH Sarabun PSK" w:cs="TH Sarabun PSK"/>
+                <w:b w:val="0"/>
+                <w:i w:val="0"/>
+                <w:sz w:val="28"/>
               </w:rPr>
-              <w:t>Data / I/O (ด้านขนาน)</w:t>
+              <w:t>🔷 สี่เหลี่ยมด้านขนาน (Data I/O)</w:t>
             </w:r>
           </w:p>
         </w:tc>
@@ -699,16 +791,19 @@
           <w:tcPr>
             <w:tcW w:type="dxa" w:w="3120"/>
             <w:tcMar>
-              <w:top w:w="80" w:type="dxa"/>
-              <w:bottom w:w="80" w:type="dxa"/>
-              <w:left w:w="120" w:type="dxa"/>
-              <w:right w:w="120" w:type="dxa"/>
+              <w:top w:w="60" w:type="dxa"/>
+              <w:bottom w:w="60" w:type="dxa"/>
+              <w:left w:w="100" w:type="dxa"/>
+              <w:right w:w="100" w:type="dxa"/>
             </w:tcMar>
           </w:tcPr>
           <w:p>
             <w:r>
               <w:rPr>
-                <w:sz w:val="20"/>
+                <w:rFonts w:ascii="TH Sarabun PSK" w:hAnsi="TH Sarabun PSK" w:cs="TH Sarabun PSK"/>
+                <w:b w:val="0"/>
+                <w:i w:val="0"/>
+                <w:sz w:val="28"/>
               </w:rPr>
               <w:t>การรับ-แสดงข้อมูล</w:t>
             </w:r>
@@ -718,18 +813,21 @@
           <w:tcPr>
             <w:tcW w:type="dxa" w:w="3120"/>
             <w:tcMar>
-              <w:top w:w="80" w:type="dxa"/>
-              <w:bottom w:w="80" w:type="dxa"/>
-              <w:left w:w="120" w:type="dxa"/>
-              <w:right w:w="120" w:type="dxa"/>
+              <w:top w:w="60" w:type="dxa"/>
+              <w:bottom w:w="60" w:type="dxa"/>
+              <w:left w:w="100" w:type="dxa"/>
+              <w:right w:w="100" w:type="dxa"/>
             </w:tcMar>
           </w:tcPr>
           <w:p>
             <w:r>
               <w:rPr>
-                <w:sz w:val="20"/>
+                <w:rFonts w:ascii="TH Sarabun PSK" w:hAnsi="TH Sarabun PSK" w:cs="TH Sarabun PSK"/>
+                <w:b w:val="0"/>
+                <w:i w:val="0"/>
+                <w:sz w:val="28"/>
               </w:rPr>
-              <w:t>การเลือกรายวิชา, การระบุจำนวนยืม-เบิก, การแสดงผลตาราง</w:t>
+              <w:t>การเลือกรายวิชา, การระบุจำนวนยืม-เบิก, แสดงตาราง</w:t>
             </w:r>
           </w:p>
         </w:tc>
@@ -739,18 +837,21 @@
           <w:tcPr>
             <w:tcW w:type="dxa" w:w="3120"/>
             <w:tcMar>
-              <w:top w:w="80" w:type="dxa"/>
-              <w:bottom w:w="80" w:type="dxa"/>
-              <w:left w:w="120" w:type="dxa"/>
-              <w:right w:w="120" w:type="dxa"/>
+              <w:top w:w="60" w:type="dxa"/>
+              <w:bottom w:w="60" w:type="dxa"/>
+              <w:left w:w="100" w:type="dxa"/>
+              <w:right w:w="100" w:type="dxa"/>
             </w:tcMar>
           </w:tcPr>
           <w:p>
             <w:r>
               <w:rPr>
-                <w:sz w:val="20"/>
+                <w:rFonts w:ascii="TH Sarabun PSK" w:hAnsi="TH Sarabun PSK" w:cs="TH Sarabun PSK"/>
+                <w:b w:val="0"/>
+                <w:i w:val="0"/>
+                <w:sz w:val="28"/>
               </w:rPr>
-              <w:t>Document (เอกสาร)</w:t>
+              <w:t>📄 เอกสาร (Document)</w:t>
             </w:r>
           </w:p>
         </w:tc>
@@ -758,16 +859,19 @@
           <w:tcPr>
             <w:tcW w:type="dxa" w:w="3120"/>
             <w:tcMar>
-              <w:top w:w="80" w:type="dxa"/>
-              <w:bottom w:w="80" w:type="dxa"/>
-              <w:left w:w="120" w:type="dxa"/>
-              <w:right w:w="120" w:type="dxa"/>
+              <w:top w:w="60" w:type="dxa"/>
+              <w:bottom w:w="60" w:type="dxa"/>
+              <w:left w:w="100" w:type="dxa"/>
+              <w:right w:w="100" w:type="dxa"/>
             </w:tcMar>
           </w:tcPr>
           <w:p>
             <w:r>
               <w:rPr>
-                <w:sz w:val="20"/>
+                <w:rFonts w:ascii="TH Sarabun PSK" w:hAnsi="TH Sarabun PSK" w:cs="TH Sarabun PSK"/>
+                <w:b w:val="0"/>
+                <w:i w:val="0"/>
+                <w:sz w:val="28"/>
               </w:rPr>
               <w:t>เอกสารและแจ้งเตือน</w:t>
             </w:r>
@@ -777,33 +881,36 @@
           <w:tcPr>
             <w:tcW w:type="dxa" w:w="3120"/>
             <w:tcMar>
-              <w:top w:w="80" w:type="dxa"/>
-              <w:bottom w:w="80" w:type="dxa"/>
-              <w:left w:w="120" w:type="dxa"/>
-              <w:right w:w="120" w:type="dxa"/>
+              <w:top w:w="60" w:type="dxa"/>
+              <w:bottom w:w="60" w:type="dxa"/>
+              <w:left w:w="100" w:type="dxa"/>
+              <w:right w:w="100" w:type="dxa"/>
             </w:tcMar>
           </w:tcPr>
           <w:p>
             <w:r>
               <w:rPr>
-                <w:sz w:val="20"/>
+                <w:rFonts w:ascii="TH Sarabun PSK" w:hAnsi="TH Sarabun PSK" w:cs="TH Sarabun PSK"/>
+                <w:b w:val="0"/>
+                <w:i w:val="0"/>
+                <w:sz w:val="28"/>
               </w:rPr>
-              <w:t>การออกบัตร E-Ticket, QR Code, หรือใบสรุปรายงาน</w:t>
+              <w:t>การออกบัตร Digital E-Ticket และ QR Code</w:t>
             </w:r>
           </w:p>
         </w:tc>
       </w:tr>
     </w:tbl>
+    <w:p/>
     <w:p>
-      <w:pPr>
-        <w:spacing w:before="200"/>
-      </w:pPr>
-    </w:p>
-    <w:p>
-      <w:pPr>
-        <w:pStyle w:val="Heading2"/>
-      </w:pPr>
       <w:r>
+        <w:rPr>
+          <w:rFonts w:ascii="TH Sarabun PSK" w:hAnsi="TH Sarabun PSK" w:cs="TH Sarabun PSK"/>
+          <w:b/>
+          <w:i w:val="0"/>
+          <w:color w:val="0F766E"/>
+          <w:sz w:val="36"/>
+        </w:rPr>
         <w:t>2.1 ผังงานภาพรวมการใช้งานของนิสิต (Overall Student Lifecycle)</w:t>
       </w:r>
     </w:p>
@@ -849,10 +956,13 @@
       </w:pPr>
       <w:r>
         <w:rPr>
+          <w:rFonts w:ascii="TH Sarabun PSK" w:hAnsi="TH Sarabun PSK" w:cs="TH Sarabun PSK"/>
+          <w:b w:val="0"/>
           <w:i/>
-          <w:sz w:val="19"/>
+          <w:color w:val="64748B"/>
+          <w:sz w:val="28"/>
         </w:rPr>
-        <w:t>ผังงานที่ 1: ภาพรวมกระบวนการใช้งานระบบของนิสิตพยาบาล (Student Lifecycle)</w:t>
+        <w:t>ผังงานที่ 1: ภาพรวมกระบวนการใช้งานระบบของนิสิตพยาบาล (เส้นตรงมาตรฐาน ISO 5807)</w:t>
       </w:r>
     </w:p>
     <w:p>
@@ -861,10 +971,14 @@
       </w:r>
     </w:p>
     <w:p>
-      <w:pPr>
-        <w:pStyle w:val="Heading2"/>
-      </w:pPr>
       <w:r>
+        <w:rPr>
+          <w:rFonts w:ascii="TH Sarabun PSK" w:hAnsi="TH Sarabun PSK" w:cs="TH Sarabun PSK"/>
+          <w:b/>
+          <w:i w:val="0"/>
+          <w:color w:val="0F766E"/>
+          <w:sz w:val="36"/>
+        </w:rPr>
         <w:t>2.2 ผังงานการยืม-เบิก One-Stop และระบบ Patient Safety Lock</w:t>
       </w:r>
     </w:p>
@@ -910,10 +1024,13 @@
       </w:pPr>
       <w:r>
         <w:rPr>
+          <w:rFonts w:ascii="TH Sarabun PSK" w:hAnsi="TH Sarabun PSK" w:cs="TH Sarabun PSK"/>
+          <w:b w:val="0"/>
           <w:i/>
-          <w:sz w:val="19"/>
+          <w:color w:val="64748B"/>
+          <w:sz w:val="28"/>
         </w:rPr>
-        <w:t>ผังงานที่ 2: ขั้นตอนการยืม-เบิกแบบ One-Stop พร้อมเงื่อนไขตรวจสอบความปลอดภัย</w:t>
+        <w:t>ผังงานที่ 2: ขั้นตอนการยืม-เบิก One-Stop พร้อมเงื่อนไขตรวจสอบความปลอดภัย (เส้นตรงมาตรฐาน)</w:t>
       </w:r>
     </w:p>
     <w:p>
@@ -922,10 +1039,14 @@
       </w:r>
     </w:p>
     <w:p>
-      <w:pPr>
-        <w:pStyle w:val="Heading2"/>
-      </w:pPr>
       <w:r>
+        <w:rPr>
+          <w:rFonts w:ascii="TH Sarabun PSK" w:hAnsi="TH Sarabun PSK" w:cs="TH Sarabun PSK"/>
+          <w:b/>
+          <w:i w:val="0"/>
+          <w:color w:val="0F766E"/>
+          <w:sz w:val="36"/>
+        </w:rPr>
         <w:t>2.3 ผังงานการจองห้องปฏิบัติการและ Check-in สแกนเข้าห้อง</w:t>
       </w:r>
     </w:p>
@@ -971,10 +1092,13 @@
       </w:pPr>
       <w:r>
         <w:rPr>
+          <w:rFonts w:ascii="TH Sarabun PSK" w:hAnsi="TH Sarabun PSK" w:cs="TH Sarabun PSK"/>
+          <w:b w:val="0"/>
           <w:i/>
-          <w:sz w:val="19"/>
+          <w:color w:val="64748B"/>
+          <w:sz w:val="28"/>
         </w:rPr>
-        <w:t>ผังงานที่ 3: ขั้นตอนการจองห้องปฏิบัติการและ Check-in สแกนเข้าห้อง</w:t>
+        <w:t>ผังงานที่ 3: ขั้นตอนการจองห้องแล็บและ Check-in สแกนเข้าห้อง (เส้นตรงมาตรฐาน)</w:t>
       </w:r>
     </w:p>
     <w:p>
@@ -983,31 +1107,33 @@
       </w:r>
     </w:p>
     <w:p>
-      <w:pPr>
-        <w:pStyle w:val="Heading1"/>
-      </w:pPr>
       <w:r>
         <w:rPr>
-          <w:rFonts w:ascii="Prompt" w:hAnsi="Prompt"/>
+          <w:rFonts w:ascii="TH Sarabun PSK" w:hAnsi="TH Sarabun PSK" w:cs="TH Sarabun PSK"/>
+          <w:b/>
+          <w:i w:val="0"/>
           <w:color w:val="0F766E"/>
+          <w:sz w:val="40"/>
         </w:rPr>
-        <w:t>บทที่ 3: ขั้นตอนการยืม-คืนครุภัณฑ์ และเบิกพัสดุสิ้นเปลือง</w:t>
+        <w:t>บทที่ 3: ขั้นตอนการยืม-เบิกอุปกรณ์แบบ One-Stop (ภาพจากระบบจริง)</w:t>
       </w:r>
     </w:p>
     <w:p>
       <w:r>
-        <w:t>ระบบ One-Stop Requisition รวมการขออุปกรณ์ 2 รูปแบบไว้ในฟอร์มเดียวกัน:</w:t>
-        <w:br/>
-        <w:t>1. ครุภัณฑ์ (Equipment): อุปกรณ์ทางการแพทย์ที่ต้องส่งคืนหลังเสร็จสิ้นการใช้งาน</w:t>
-        <w:br/>
-        <w:t>2. วัสดุเวชภัณฑ์สิ้นเปลือง (Consumables): พัสดุใช้หมดไป เช่น ถุงมือ, ผ้ากอซ, สำลี</w:t>
+        <w:rPr>
+          <w:rFonts w:ascii="TH Sarabun PSK" w:hAnsi="TH Sarabun PSK" w:cs="TH Sarabun PSK"/>
+          <w:b w:val="0"/>
+          <w:i w:val="0"/>
+          <w:sz w:val="32"/>
+        </w:rPr>
+        <w:t>เมื่อกดปุ่ม '+ ขอยืม-เบิกอุปกรณ์ (One-Stop)' ระบบจะเปิดหน้าต่างฟอร์มรวมดังรูปที่ 3.1 ให้นิสิตกรอกข้อมูลตามหมายเลขกำกับในแต่ละช่องดังนี้:</w:t>
       </w:r>
     </w:p>
     <w:p>
       <w:r>
         <w:drawing>
           <wp:inline xmlns:a="http://schemas.openxmlformats.org/drawingml/2006/main" xmlns:pic="http://schemas.openxmlformats.org/drawingml/2006/picture">
-            <wp:extent cx="5303520" cy="4640580"/>
+            <wp:extent cx="5303520" cy="4051300"/>
             <wp:docPr id="5" name="Picture 5"/>
             <wp:cNvGraphicFramePr>
               <a:graphicFrameLocks noChangeAspect="1"/>
@@ -1016,7 +1142,7 @@
               <a:graphicData uri="http://schemas.openxmlformats.org/drawingml/2006/picture">
                 <pic:pic>
                   <pic:nvPicPr>
-                    <pic:cNvPr id="0" name="ui_mockup_unified_request.png"/>
+                    <pic:cNvPr id="0" name="step_borrow_one_stop_guide.png"/>
                     <pic:cNvPicPr/>
                   </pic:nvPicPr>
                   <pic:blipFill>
@@ -1028,7 +1154,7 @@
                   <pic:spPr>
                     <a:xfrm>
                       <a:off x="0" y="0"/>
-                      <a:ext cx="5303520" cy="4640580"/>
+                      <a:ext cx="5303520" cy="4051300"/>
                     </a:xfrm>
                     <a:prstGeom prst="rect"/>
                   </pic:spPr>
@@ -1045,35 +1171,207 @@
       </w:pPr>
       <w:r>
         <w:rPr>
+          <w:rFonts w:ascii="TH Sarabun PSK" w:hAnsi="TH Sarabun PSK" w:cs="TH Sarabun PSK"/>
+          <w:b w:val="0"/>
           <w:i/>
-          <w:sz w:val="19"/>
+          <w:color w:val="64748B"/>
+          <w:sz w:val="28"/>
         </w:rPr>
-        <w:t>รูปที่ 3.1: หน้าต่างสร้างคำขอยืม-เบิกแบบ One-Stop (Unified Requisition)</w:t>
+        <w:t>รูปที่ 3.1: ภาพจากระบบจริง - ชี้ตำแหน่งและสิ่งที่ต้องกรอกในแต่ละช่อง (จุดที่ 1 ถึง 7)</w:t>
+      </w:r>
+    </w:p>
+    <w:p/>
+    <w:p>
+      <w:r>
+        <w:rPr>
+          <w:rFonts w:ascii="TH Sarabun PSK" w:hAnsi="TH Sarabun PSK" w:cs="TH Sarabun PSK"/>
+          <w:b/>
+          <w:i w:val="0"/>
+          <w:color w:val="0F766E"/>
+          <w:sz w:val="36"/>
+        </w:rPr>
+        <w:t>รายละเอียดสิ่งที่ต้องกรอกในแต่ละช่อง (คำอธิบายตามหมายเลข):</w:t>
       </w:r>
     </w:p>
     <w:p>
       <w:pPr>
-        <w:pStyle w:val="Heading2"/>
+        <w:spacing w:after="120"/>
       </w:pPr>
       <w:r>
-        <w:t>ขั้นตอนการทำรายการ:</w:t>
+        <w:rPr>
+          <w:rFonts w:ascii="TH Sarabun PSK" w:hAnsi="TH Sarabun PSK" w:cs="TH Sarabun PSK"/>
+          <w:b/>
+          <w:i w:val="0"/>
+          <w:color w:val="0F766E"/>
+          <w:sz w:val="32"/>
+        </w:rPr>
+        <w:t>• จุดที่ 1: เลือกวัตถุประสงค์การใช้งาน (Use Target &amp; Safety Lock)</w:t>
+        <w:br/>
+      </w:r>
+      <w:r>
+        <w:rPr>
+          <w:rFonts w:ascii="TH Sarabun PSK" w:hAnsi="TH Sarabun PSK" w:cs="TH Sarabun PSK"/>
+          <w:b w:val="0"/>
+          <w:i w:val="0"/>
+          <w:sz w:val="32"/>
+        </w:rPr>
+        <w:t>นิสิตต้องเลือกระหว่าง:</w:t>
+        <w:br/>
+        <w:t xml:space="preserve">  • 🧪 ฝึกปฏิบัติการกับหุ่นจำลอง (Sim-Lab) [แนะนำ]: สำหรับการฝึกซ้อมในห้องแล็บ ระบบอนุญาตให้เบิกเวชภัณฑ์ที่หมดอายุแล้วสำหรับการฝึกซ้อมได้ เพื่อช่วยประหยัดงบประมาณของคณะ</w:t>
+        <w:br/>
+        <w:t xml:space="preserve">  • 🧑‍⚕️ ใช้งานกับคนจริง / คลินิก (Clinical Patient): สำหรับหัตถการกับผู้ป่วยจริงบนหอผู้ป่วย ระบบ Patient Safety Lock จะทำงานทันที โดยจะบล็อกล็อตหมดอายุ 100% และจ่ายเฉพาะเวชภัณฑ์ที่ยังไม่หมดอายุเท่านั้น</w:t>
       </w:r>
     </w:p>
     <w:p>
+      <w:pPr>
+        <w:spacing w:after="120"/>
+      </w:pPr>
       <w:r>
-        <w:t>1. กดปุ่ม '+ ขอยืม-เบิกอุปกรณ์ (One-Stop)' บนเมนูหลัก</w:t>
+        <w:rPr>
+          <w:rFonts w:ascii="TH Sarabun PSK" w:hAnsi="TH Sarabun PSK" w:cs="TH Sarabun PSK"/>
+          <w:b/>
+          <w:i w:val="0"/>
+          <w:color w:val="0F766E"/>
+          <w:sz w:val="32"/>
+        </w:rPr>
+        <w:t>• จุดที่ 2: เลือกรหัสรายวิชาทางการพยาบาล</w:t>
         <w:br/>
-        <w:t>2. เลือกวัตถุประสงค์การใช้งาน (Use Target):</w:t>
+      </w:r>
+      <w:r>
+        <w:rPr>
+          <w:rFonts w:ascii="TH Sarabun PSK" w:hAnsi="TH Sarabun PSK" w:cs="TH Sarabun PSK"/>
+          <w:b w:val="0"/>
+          <w:i w:val="0"/>
+          <w:sz w:val="32"/>
+        </w:rPr>
+        <w:t>กดเลือกรายวิชาที่นิสิตกำลังเรียน เช่น NS201 การพยาบาลพื้นฐาน จุดเด่นของระบบคือ: เมื่อเลือกวิชาแล้ว ระบบจะดึงชื่ออาจารย์ผู้รับผิดชอบรายวิชาขึ้นมาให้อัตโนมัติทันที นิสิตไม่ต้องพิมพ์ชื่ออาจารย์เอง</w:t>
+      </w:r>
+    </w:p>
+    <w:p>
+      <w:pPr>
+        <w:spacing w:after="120"/>
+      </w:pPr>
+      <w:r>
+        <w:rPr>
+          <w:rFonts w:ascii="TH Sarabun PSK" w:hAnsi="TH Sarabun PSK" w:cs="TH Sarabun PSK"/>
+          <w:b/>
+          <w:i w:val="0"/>
+          <w:color w:val="0F766E"/>
+          <w:sz w:val="32"/>
+        </w:rPr>
+        <w:t>• จุดที่ 3: ระบุวันและเวลาที่รับของ และกำหนดวันส่งคืน</w:t>
         <w:br/>
-        <w:t xml:space="preserve">    • 🧪 ฝึกกับหุ่นจำลอง (Sim-Lab): อนุญาตให้เบิกเวชภัณฑ์หมดอายุได้เพื่อประหยัดทรัพยากร</w:t>
+      </w:r>
+      <w:r>
+        <w:rPr>
+          <w:rFonts w:ascii="TH Sarabun PSK" w:hAnsi="TH Sarabun PSK" w:cs="TH Sarabun PSK"/>
+          <w:b w:val="0"/>
+          <w:i w:val="0"/>
+          <w:sz w:val="32"/>
+        </w:rPr>
+        <w:t xml:space="preserve">  • วัน-เวลาที่ต้องการรับของ: ระบุวันและเวลาที่นิสิตจะเดินทางมารับอุปกรณ์ที่เคาน์เตอร์ห้องแล็บ</w:t>
         <w:br/>
-        <w:t xml:space="preserve">    • 🧑‍⚕️ ใช้งานกับคนจริง (Clinical Patient): ระบบเปิด Patient Safety Lock บล็อกล็อตหมดอายุ 100%</w:t>
+        <w:t xml:space="preserve">  • กำหนดวันส่งคืนครุภัณฑ์: ระบุวันและเวลาที่ต้องนำครุภัณฑ์มาส่งคืนหลังเสร็จสิ้นการฝึกปฏิบัติ</w:t>
+      </w:r>
+    </w:p>
+    <w:p>
+      <w:pPr>
+        <w:spacing w:after="120"/>
+      </w:pPr>
+      <w:r>
+        <w:rPr>
+          <w:rFonts w:ascii="TH Sarabun PSK" w:hAnsi="TH Sarabun PSK" w:cs="TH Sarabun PSK"/>
+          <w:b/>
+          <w:i w:val="0"/>
+          <w:color w:val="0F766E"/>
+          <w:sz w:val="32"/>
+        </w:rPr>
+        <w:t>• จุดที่ 4: ระบุวัตถุประสงค์และสถานที่ใช้งาน</w:t>
         <w:br/>
-        <w:t>3. เลือกรหัสวิชาทางการพยาบาล: ระบบจะค้นหาและระบุอาจารย์ผู้รับผิดชอบรายวิชาให้อัตโนมัติ</w:t>
+      </w:r>
+      <w:r>
+        <w:rPr>
+          <w:rFonts w:ascii="TH Sarabun PSK" w:hAnsi="TH Sarabun PSK" w:cs="TH Sarabun PSK"/>
+          <w:b w:val="0"/>
+          <w:i w:val="0"/>
+          <w:sz w:val="32"/>
+        </w:rPr>
+        <w:t>พิมพ์ระบุหัตถการและสถานที่ใช้งาน เช่น 'ฝึกทักษะการทำแผลปลอดเชื้อและตรวจวัดสัญญาณชีพ OSCE ณ ห้อง Lab Skill 101'</w:t>
+      </w:r>
+    </w:p>
+    <w:p>
+      <w:pPr>
+        <w:spacing w:after="120"/>
+      </w:pPr>
+      <w:r>
+        <w:rPr>
+          <w:rFonts w:ascii="TH Sarabun PSK" w:hAnsi="TH Sarabun PSK" w:cs="TH Sarabun PSK"/>
+          <w:b/>
+          <w:i w:val="0"/>
+          <w:color w:val="0F766E"/>
+          <w:sz w:val="32"/>
+        </w:rPr>
+        <w:t>• จุดที่ 5: เลือกรายการครุภัณฑ์ที่ยืม (Equipment)</w:t>
         <w:br/>
-        <w:t>4. ระบุวัน-เวลานัดหมายรับของ และกำหนดวันส่งคืน</w:t>
+      </w:r>
+      <w:r>
+        <w:rPr>
+          <w:rFonts w:ascii="TH Sarabun PSK" w:hAnsi="TH Sarabun PSK" w:cs="TH Sarabun PSK"/>
+          <w:b w:val="0"/>
+          <w:i w:val="0"/>
+          <w:sz w:val="32"/>
+        </w:rPr>
+        <w:t>ค้นหาและเลือกอุปกรณ์ทางการแพทย์ที่ต้องส่งคืน เช่น หุ่นฝึกทำแผล, เครื่องวัดความดันโลหิต, หูฟังแพทย์ Stethoscope พร้อมระบุจำนวนชิ้นที่ต้องการยืม</w:t>
+      </w:r>
+    </w:p>
+    <w:p>
+      <w:pPr>
+        <w:spacing w:after="120"/>
+      </w:pPr>
+      <w:r>
+        <w:rPr>
+          <w:rFonts w:ascii="TH Sarabun PSK" w:hAnsi="TH Sarabun PSK" w:cs="TH Sarabun PSK"/>
+          <w:b/>
+          <w:i w:val="0"/>
+          <w:color w:val="0F766E"/>
+          <w:sz w:val="32"/>
+        </w:rPr>
+        <w:t>• จุดที่ 6: เลือกรายการเวชภัณฑ์สิ้นเปลืองที่ขอเบิก (Consumables)</w:t>
         <w:br/>
-        <w:t>5. เลือกรายการอุปกรณ์และจำนวนที่ต้องการ จากนั้นกดยืนยันส่งคำขอ</w:t>
+      </w:r>
+      <w:r>
+        <w:rPr>
+          <w:rFonts w:ascii="TH Sarabun PSK" w:hAnsi="TH Sarabun PSK" w:cs="TH Sarabun PSK"/>
+          <w:b w:val="0"/>
+          <w:i w:val="0"/>
+          <w:sz w:val="32"/>
+        </w:rPr>
+        <w:t>ค้นหาและเลือกเวชภัณฑ์ใช้หมดไป เช่น ถุงมือตรวจโรค, ผ้ากอซสเตอไรล์, สำลีก้อนปลอดเชื้อ พร้อมระบุจำนวนและหน่วยบรรจุที่ขอเบิก</w:t>
+      </w:r>
+    </w:p>
+    <w:p>
+      <w:pPr>
+        <w:spacing w:after="120"/>
+      </w:pPr>
+      <w:r>
+        <w:rPr>
+          <w:rFonts w:ascii="TH Sarabun PSK" w:hAnsi="TH Sarabun PSK" w:cs="TH Sarabun PSK"/>
+          <w:b/>
+          <w:i w:val="0"/>
+          <w:color w:val="0F766E"/>
+          <w:sz w:val="32"/>
+        </w:rPr>
+        <w:t>• จุดที่ 7: กดปุ่มยืนยันส่งคำขอ One-Stop</w:t>
+        <w:br/>
+      </w:r>
+      <w:r>
+        <w:rPr>
+          <w:rFonts w:ascii="TH Sarabun PSK" w:hAnsi="TH Sarabun PSK" w:cs="TH Sarabun PSK"/>
+          <w:b w:val="0"/>
+          <w:i w:val="0"/>
+          <w:sz w:val="32"/>
+        </w:rPr>
+        <w:t>ตรวจสอบความถูกต้องของข้อมูลทั้งหมด แล้วกดปุ่ม '🚀 ยืนยันและส่งคำขอ One-Stop' ระบบจะส่งคำขอไปยังอาจารย์ประจำวิชาเพื่อรับทราบ และส่งต่อให้เจ้าหน้าที่ห้องแล็บตรวจสอบอนุมัติ</w:t>
       </w:r>
     </w:p>
     <w:p>
@@ -1082,27 +1380,33 @@
       </w:r>
     </w:p>
     <w:p>
-      <w:pPr>
-        <w:pStyle w:val="Heading1"/>
-      </w:pPr>
       <w:r>
         <w:rPr>
-          <w:rFonts w:ascii="Prompt" w:hAnsi="Prompt"/>
+          <w:rFonts w:ascii="TH Sarabun PSK" w:hAnsi="TH Sarabun PSK" w:cs="TH Sarabun PSK"/>
+          <w:b/>
+          <w:i w:val="0"/>
           <w:color w:val="0F766E"/>
+          <w:sz w:val="40"/>
         </w:rPr>
         <w:t>บทที่ 4: การขอเบิกชุดฝึกปฏิบัติการสำเร็จรูป (Nursing Practice Kits)</w:t>
       </w:r>
     </w:p>
     <w:p>
       <w:r>
-        <w:t>เพื่อความสะดวกรวดเร็วในการฝึกหัตถการทางการพยาบาล คณะได้จัดเตรียมชุดอุปกรณ์สำเร็จรูป (Box Sets) ซึ่งรวบรวมอุปกรณ์และเวชภัณฑ์ที่จำเป็นสำหรับแต่ละหัตถการไว้ครบถ้วนในกล่องเดียว</w:t>
+        <w:rPr>
+          <w:rFonts w:ascii="TH Sarabun PSK" w:hAnsi="TH Sarabun PSK" w:cs="TH Sarabun PSK"/>
+          <w:b w:val="0"/>
+          <w:i w:val="0"/>
+          <w:sz w:val="32"/>
+        </w:rPr>
+        <w:t>ชุด Box Set รวมอุปกรณ์มาตรฐานตามหัตถการทางการพยาบาล ช่วยให้นิสิตขอเบิกได้ครบชุดในคลิกเดียว (One-Click):</w:t>
       </w:r>
     </w:p>
     <w:p>
       <w:r>
         <w:drawing>
           <wp:inline xmlns:a="http://schemas.openxmlformats.org/drawingml/2006/main" xmlns:pic="http://schemas.openxmlformats.org/drawingml/2006/picture">
-            <wp:extent cx="5303520" cy="3535680"/>
+            <wp:extent cx="5303520" cy="4051300"/>
             <wp:docPr id="6" name="Picture 6"/>
             <wp:cNvGraphicFramePr>
               <a:graphicFrameLocks noChangeAspect="1"/>
@@ -1111,7 +1415,7 @@
               <a:graphicData uri="http://schemas.openxmlformats.org/drawingml/2006/picture">
                 <pic:pic>
                   <pic:nvPicPr>
-                    <pic:cNvPr id="0" name="ui_mockup_kits.png"/>
+                    <pic:cNvPr id="0" name="step_kits_guide.png"/>
                     <pic:cNvPicPr/>
                   </pic:nvPicPr>
                   <pic:blipFill>
@@ -1123,7 +1427,7 @@
                   <pic:spPr>
                     <a:xfrm>
                       <a:off x="0" y="0"/>
-                      <a:ext cx="5303520" cy="3535680"/>
+                      <a:ext cx="5303520" cy="4051300"/>
                     </a:xfrm>
                     <a:prstGeom prst="rect"/>
                   </pic:spPr>
@@ -1140,23 +1444,61 @@
       </w:pPr>
       <w:r>
         <w:rPr>
+          <w:rFonts w:ascii="TH Sarabun PSK" w:hAnsi="TH Sarabun PSK" w:cs="TH Sarabun PSK"/>
+          <w:b w:val="0"/>
           <w:i/>
-          <w:sz w:val="19"/>
+          <w:color w:val="64748B"/>
+          <w:sz w:val="28"/>
         </w:rPr>
-        <w:t>รูปที่ 4.1: หน้ารายการชุดฝึกปฏิบัติการสำเร็จรูป (Nursing Practice Kits)</w:t>
+        <w:t>รูปที่ 4.1: ภาพจากระบบจริง - หน้ารายการชุดฝึกสำเร็จรูป พร้อมขั้นตอน 1-2</w:t>
       </w:r>
     </w:p>
     <w:p>
+      <w:pPr>
+        <w:spacing w:after="80"/>
+      </w:pPr>
       <w:r>
-        <w:t>วิธีการขอเบิกแบบ One-Click:</w:t>
-        <w:br/>
-        <w:t>1. เข้าเมนู 'ชุดฝึกปฏิบัติการ (Practice Kits)'</w:t>
-        <w:br/>
-        <w:t>2. ค้นหาชุดฝึกตามหัตถการ เช่น ชุดฝึกทำแผลปลอดเชื้อ (KIT-01) หรือ ชุดฝึกสวนปัสสาวะ (KIT-02)</w:t>
-        <w:br/>
-        <w:t>3. กดปุ่ม '⚡ ขอเบิกชุดนี้ทันที (One-Click)'</w:t>
-        <w:br/>
-        <w:t>4. ตรวจสอบรายการและกดยืนยัน คำขอจะถูกส่งเพื่อจัดเตรียมทันที</w:t>
+        <w:rPr>
+          <w:rFonts w:ascii="TH Sarabun PSK" w:hAnsi="TH Sarabun PSK" w:cs="TH Sarabun PSK"/>
+          <w:b/>
+          <w:i w:val="0"/>
+          <w:color w:val="0F766E"/>
+          <w:sz w:val="32"/>
+        </w:rPr>
+        <w:t>• ขั้นตอนที่ 1:</w:t>
+      </w:r>
+      <w:r>
+        <w:rPr>
+          <w:rFonts w:ascii="TH Sarabun PSK" w:hAnsi="TH Sarabun PSK" w:cs="TH Sarabun PSK"/>
+          <w:b w:val="0"/>
+          <w:i w:val="0"/>
+          <w:sz w:val="32"/>
+        </w:rPr>
+        <w:t xml:space="preserve"> เลือกชุด Box Set ตามหัตถการในบทเรียน เช่น ชุดทำแผลปลอดเชื้อ, ชุดฝึกสวนปัสสาวะ</w:t>
+      </w:r>
+    </w:p>
+    <w:p>
+      <w:pPr>
+        <w:spacing w:after="80"/>
+      </w:pPr>
+      <w:r>
+        <w:rPr>
+          <w:rFonts w:ascii="TH Sarabun PSK" w:hAnsi="TH Sarabun PSK" w:cs="TH Sarabun PSK"/>
+          <w:b/>
+          <w:i w:val="0"/>
+          <w:color w:val="0F766E"/>
+          <w:sz w:val="32"/>
+        </w:rPr>
+        <w:t>• ขั้นตอนที่ 2:</w:t>
+      </w:r>
+      <w:r>
+        <w:rPr>
+          <w:rFonts w:ascii="TH Sarabun PSK" w:hAnsi="TH Sarabun PSK" w:cs="TH Sarabun PSK"/>
+          <w:b w:val="0"/>
+          <w:i w:val="0"/>
+          <w:sz w:val="32"/>
+        </w:rPr>
+        <w:t xml:space="preserve"> ตรวจสอบรายการเวชภัณฑ์ในชุด และกดปุ่ม '⚡ ขอเบิกชุดนี้ทันที (One-Click)'</w:t>
       </w:r>
     </w:p>
     <w:p>
@@ -1165,27 +1507,33 @@
       </w:r>
     </w:p>
     <w:p>
-      <w:pPr>
-        <w:pStyle w:val="Heading1"/>
-      </w:pPr>
       <w:r>
         <w:rPr>
-          <w:rFonts w:ascii="Prompt" w:hAnsi="Prompt"/>
+          <w:rFonts w:ascii="TH Sarabun PSK" w:hAnsi="TH Sarabun PSK" w:cs="TH Sarabun PSK"/>
+          <w:b/>
+          <w:i w:val="0"/>
           <w:color w:val="0F766E"/>
+          <w:sz w:val="40"/>
         </w:rPr>
-        <w:t>บทที่ 5: การขอเข้าฝึกปฏิบัติการด้วยตนเองและสแกน QR Code</w:t>
+        <w:t>บทที่ 5: การขอเข้าฝึกปฏิบัติการด้วยตนเองและการ Check-in</w:t>
       </w:r>
     </w:p>
     <w:p>
       <w:r>
-        <w:t>นิสิตสามารถจองห้องปฏิบัติการและเตียงฝึกซ้อมนอกเวลาเรียนเพื่อทบทวนทักษะ หรือเตรียมสอบ OSCE ผ่านระบบจองรอบเวลา (Time Slots Booking) และรับ Digital E-Ticket พร้อม QR Code สำหรับ Check-in</w:t>
+        <w:rPr>
+          <w:rFonts w:ascii="TH Sarabun PSK" w:hAnsi="TH Sarabun PSK" w:cs="TH Sarabun PSK"/>
+          <w:b w:val="0"/>
+          <w:i w:val="0"/>
+          <w:sz w:val="32"/>
+        </w:rPr>
+        <w:t>นิสิตสามารถจองห้องปฏิบัติการและเตียงฝึกซ้อมนอกเวลาเรียนเพื่อทบทวนทักษะ OSCE โดยเลือกรอบเวลาและรับ Digital E-Ticket พร้อม QR Code สำหรับ Check-in หน้าห้องแล็บ:</w:t>
       </w:r>
     </w:p>
     <w:p>
       <w:r>
         <w:drawing>
           <wp:inline xmlns:a="http://schemas.openxmlformats.org/drawingml/2006/main" xmlns:pic="http://schemas.openxmlformats.org/drawingml/2006/picture">
-            <wp:extent cx="5303520" cy="3867150"/>
+            <wp:extent cx="5303520" cy="4051300"/>
             <wp:docPr id="7" name="Picture 7"/>
             <wp:cNvGraphicFramePr>
               <a:graphicFrameLocks noChangeAspect="1"/>
@@ -1194,7 +1542,7 @@
               <a:graphicData uri="http://schemas.openxmlformats.org/drawingml/2006/picture">
                 <pic:pic>
                   <pic:nvPicPr>
-                    <pic:cNvPr id="0" name="ui_mockup_practice_booking.png"/>
+                    <pic:cNvPr id="0" name="step_booking_guide.png"/>
                     <pic:cNvPicPr/>
                   </pic:nvPicPr>
                   <pic:blipFill>
@@ -1206,7 +1554,7 @@
                   <pic:spPr>
                     <a:xfrm>
                       <a:off x="0" y="0"/>
-                      <a:ext cx="5303520" cy="3867150"/>
+                      <a:ext cx="5303520" cy="4051300"/>
                     </a:xfrm>
                     <a:prstGeom prst="rect"/>
                   </pic:spPr>
@@ -1223,10 +1571,13 @@
       </w:pPr>
       <w:r>
         <w:rPr>
+          <w:rFonts w:ascii="TH Sarabun PSK" w:hAnsi="TH Sarabun PSK" w:cs="TH Sarabun PSK"/>
+          <w:b w:val="0"/>
           <w:i/>
-          <w:sz w:val="19"/>
+          <w:color w:val="64748B"/>
+          <w:sz w:val="28"/>
         </w:rPr>
-        <w:t>รูปที่ 5.1: หน้าจอเลือกรอบเวลาและจองห้องปฏิบัติการฝึกซ้อม</w:t>
+        <w:t>รูปที่ 5.1: ภาพจากระบบจริง - หน้าจองห้องปฏิบัติการและรอบเวลา (Time Slots)</w:t>
       </w:r>
     </w:p>
     <w:p>
@@ -1271,29 +1622,109 @@
       </w:pPr>
       <w:r>
         <w:rPr>
+          <w:rFonts w:ascii="TH Sarabun PSK" w:hAnsi="TH Sarabun PSK" w:cs="TH Sarabun PSK"/>
+          <w:b w:val="0"/>
           <w:i/>
-          <w:sz w:val="19"/>
+          <w:color w:val="64748B"/>
+          <w:sz w:val="28"/>
         </w:rPr>
-        <w:t>รูปที่ 5.2: บัตร Digital E-Ticket พร้อม QR Code Check-in</w:t>
+        <w:t>รูปที่ 5.2: บัตรเข้าห้องปฏิบัติการ Digital E-Ticket พร้อม QR Code สำหรับสแกน Check-in</w:t>
       </w:r>
     </w:p>
     <w:p>
       <w:pPr>
-        <w:pStyle w:val="Heading2"/>
+        <w:spacing w:after="80"/>
       </w:pPr>
       <w:r>
-        <w:t>ขั้นตอนการ Check-in หน้าห้องแล็บ:</w:t>
+        <w:rPr>
+          <w:rFonts w:ascii="TH Sarabun PSK" w:hAnsi="TH Sarabun PSK" w:cs="TH Sarabun PSK"/>
+          <w:b/>
+          <w:i w:val="0"/>
+          <w:color w:val="0F766E"/>
+          <w:sz w:val="32"/>
+        </w:rPr>
+        <w:t>• ขั้นตอนที่ 1:</w:t>
+      </w:r>
+      <w:r>
+        <w:rPr>
+          <w:rFonts w:ascii="TH Sarabun PSK" w:hAnsi="TH Sarabun PSK" w:cs="TH Sarabun PSK"/>
+          <w:b w:val="0"/>
+          <w:i w:val="0"/>
+          <w:sz w:val="32"/>
+        </w:rPr>
+        <w:t xml:space="preserve"> เลือกห้องปฏิบัติการและวันที่ต้องการฝึกซ้อม</w:t>
       </w:r>
     </w:p>
     <w:p>
+      <w:pPr>
+        <w:spacing w:after="80"/>
+      </w:pPr>
       <w:r>
-        <w:t>1. เดินทางมาถึงหน้าห้องปฏิบัติการก่อนเวลานัดหมายอย่างน้อย 5 นาที</w:t>
-        <w:br/>
-        <w:t>2. เปิดบัตร Digital E-Ticket บนสมาร์ทโฟนของนิสิต</w:t>
-        <w:br/>
-        <w:t>3. นำ QR Code สแกนที่เครื่องสแกนหน้าห้องปฏิบัติการ</w:t>
-        <w:br/>
-        <w:t>4. เมื่อระบบตรวจสอบผ่าน สถานะจะเปลี่ยนเป็น IN_PRACTICE และเริ่มบันทึกชั่วโมงฝึกซ้อมสะสม</w:t>
+        <w:rPr>
+          <w:rFonts w:ascii="TH Sarabun PSK" w:hAnsi="TH Sarabun PSK" w:cs="TH Sarabun PSK"/>
+          <w:b/>
+          <w:i w:val="0"/>
+          <w:color w:val="0F766E"/>
+          <w:sz w:val="32"/>
+        </w:rPr>
+        <w:t>• ขั้นตอนที่ 2:</w:t>
+      </w:r>
+      <w:r>
+        <w:rPr>
+          <w:rFonts w:ascii="TH Sarabun PSK" w:hAnsi="TH Sarabun PSK" w:cs="TH Sarabun PSK"/>
+          <w:b w:val="0"/>
+          <w:i w:val="0"/>
+          <w:sz w:val="32"/>
+        </w:rPr>
+        <w:t xml:space="preserve"> เลือกรอบเวลา (Time Slot) ที่เปิดให้บริการ โดยรอบที่มีที่นั่งว่างจะแสดงจำนวนสีเขียว</w:t>
+      </w:r>
+    </w:p>
+    <w:p>
+      <w:pPr>
+        <w:spacing w:after="80"/>
+      </w:pPr>
+      <w:r>
+        <w:rPr>
+          <w:rFonts w:ascii="TH Sarabun PSK" w:hAnsi="TH Sarabun PSK" w:cs="TH Sarabun PSK"/>
+          <w:b/>
+          <w:i w:val="0"/>
+          <w:color w:val="0F766E"/>
+          <w:sz w:val="32"/>
+        </w:rPr>
+        <w:t>• ขั้นตอนที่ 3:</w:t>
+      </w:r>
+      <w:r>
+        <w:rPr>
+          <w:rFonts w:ascii="TH Sarabun PSK" w:hAnsi="TH Sarabun PSK" w:cs="TH Sarabun PSK"/>
+          <w:b w:val="0"/>
+          <w:i w:val="0"/>
+          <w:sz w:val="32"/>
+        </w:rPr>
+        <w:t xml:space="preserve"> ระบุรายวิชาและวัตถุประสงค์ จากนั้นกดยืนยันการจองเพื่อรับ Digital E-Ticket</w:t>
+      </w:r>
+    </w:p>
+    <w:p>
+      <w:pPr>
+        <w:spacing w:after="80"/>
+      </w:pPr>
+      <w:r>
+        <w:rPr>
+          <w:rFonts w:ascii="TH Sarabun PSK" w:hAnsi="TH Sarabun PSK" w:cs="TH Sarabun PSK"/>
+          <w:b/>
+          <w:i w:val="0"/>
+          <w:color w:val="0F766E"/>
+          <w:sz w:val="32"/>
+        </w:rPr>
+        <w:t>• ขั้นตอนที่ 4 (Check-in):</w:t>
+      </w:r>
+      <w:r>
+        <w:rPr>
+          <w:rFonts w:ascii="TH Sarabun PSK" w:hAnsi="TH Sarabun PSK" w:cs="TH Sarabun PSK"/>
+          <w:b w:val="0"/>
+          <w:i w:val="0"/>
+          <w:sz w:val="32"/>
+        </w:rPr>
+        <w:t xml:space="preserve"> เดินทางมาถึงหน้าห้องก่อนเวลา 5 นาที และนำ QR Code บนสมาร์ทโฟนสแกนที่เครื่องสแกนหน้าห้องแล็บเพื่อเช็คอินและเริ่มสะสมชั่วโมงฝึกปฏิบัติ</w:t>
       </w:r>
     </w:p>
     <w:p>
@@ -1302,20 +1733,15 @@
       </w:r>
     </w:p>
     <w:p>
-      <w:pPr>
-        <w:pStyle w:val="Heading1"/>
-      </w:pPr>
       <w:r>
         <w:rPr>
-          <w:rFonts w:ascii="Prompt" w:hAnsi="Prompt"/>
+          <w:rFonts w:ascii="TH Sarabun PSK" w:hAnsi="TH Sarabun PSK" w:cs="TH Sarabun PSK"/>
+          <w:b/>
+          <w:i w:val="0"/>
           <w:color w:val="0F766E"/>
+          <w:sz w:val="40"/>
         </w:rPr>
-        <w:t>บทที่ 6: การส่งคืนอุปกรณ์และข้อปฏิบัติความปลอดภัย</w:t>
-      </w:r>
-    </w:p>
-    <w:p>
-      <w:r>
-        <w:t>เพื่อรักษามาตรฐานความปลอดภัยและความพร้อมใช้ของอุปกรณ์ นิสิตต้องปฏิบัติตามกฎระเบียบอย่างเคร่งครัด:</w:t>
+        <w:t>บทที่ 6: การส่งคืนอุปกรณ์และข้อพึงระวังความปลอดภัย</w:t>
       </w:r>
     </w:p>
     <w:tbl>
@@ -1342,35 +1768,135 @@
           <w:p>
             <w:r>
               <w:rPr>
-                <w:rFonts w:ascii="Prompt" w:hAnsi="Prompt"/>
+                <w:rFonts w:ascii="TH Sarabun PSK" w:hAnsi="TH Sarabun PSK" w:cs="TH Sarabun PSK"/>
                 <w:b/>
+                <w:i w:val="0"/>
                 <w:color w:val="BE123C"/>
+                <w:sz w:val="32"/>
               </w:rPr>
-              <w:t>⚠️ ข้อพึงระวังด้านความปลอดภัยสูงสุด:</w:t>
+              <w:t>⚠️ ข้อพึงระวังด้านความปลอดภัยสูงสุด (Patient Safety Warning):</w:t>
               <w:br/>
             </w:r>
             <w:r>
               <w:rPr>
-                <w:sz w:val="21"/>
+                <w:rFonts w:ascii="TH Sarabun PSK" w:hAnsi="TH Sarabun PSK" w:cs="TH Sarabun PSK"/>
+                <w:b w:val="0"/>
+                <w:i w:val="0"/>
+                <w:sz w:val="30"/>
               </w:rPr>
-              <w:t>ห้ามนำเวชภัณฑ์หรือพัสดุที่มีป้ายเตือน 'สำหรับฝึกกับหุ่นจำลองเท่านั้น (For Simulation Only)' ไปใช้กับผู้ป่วยจริงบนหอผู้ป่วยหรือในคลินิกโดยเด็ดขาด การฝ่าฝืนถือเป็นความผิดทางวินัยร้ายแรง</w:t>
+              <w:t>ห้ามนำเวชภัณฑ์หรืออุปกรณ์ที่มีป้ายเตือน 'สำหรับฝึกกับหุ่นจำลองเท่านั้น (For Simulation Only)' ไปใช้กับผู้ป่วยจริงบนหอผู้ป่วยหรือในคลินิกโดยเด็ดขาด เพื่อความปลอดภัยสูงสุดของผู้ป่วย</w:t>
             </w:r>
           </w:p>
         </w:tc>
       </w:tr>
     </w:tbl>
+    <w:p/>
     <w:p>
       <w:r>
-        <w:br/>
+        <w:rPr>
+          <w:rFonts w:ascii="TH Sarabun PSK" w:hAnsi="TH Sarabun PSK" w:cs="TH Sarabun PSK"/>
+          <w:b/>
+          <w:i w:val="0"/>
+          <w:color w:val="0F766E"/>
+          <w:sz w:val="36"/>
+        </w:rPr>
         <w:t>ขั้นตอนการส่งคืนครุภัณฑ์:</w:t>
-        <w:br/>
-        <w:t>1. ตรวจสอบความสะอาดและจัดเก็บอุปกรณ์เข้าชุดให้เรียบร้อย</w:t>
-        <w:br/>
-        <w:t>2. นำส่งคืน ณ เคาน์เตอร์ห้องปฏิบัติการตามวัน-เวลาที่กำหนด</w:t>
-        <w:br/>
-        <w:t>3. เจ้าหน้าที่ตรวจสอบสภาพอุปกรณ์และกดยืนยันการรับคืนในระบบ สถานะเปลี่ยนเป็น RETURNED</w:t>
-        <w:br/>
-        <w:t>4. กรณีพบการชำรุดหรือสูญหาย ให้แจ้งเจ้าหน้าที่ทันทีเพื่อบันทึกในระบบและดำเนินการตามระเบียบคณะ</w:t>
+      </w:r>
+    </w:p>
+    <w:p>
+      <w:pPr>
+        <w:spacing w:after="80"/>
+      </w:pPr>
+      <w:r>
+        <w:rPr>
+          <w:rFonts w:ascii="TH Sarabun PSK" w:hAnsi="TH Sarabun PSK" w:cs="TH Sarabun PSK"/>
+          <w:b/>
+          <w:i w:val="0"/>
+          <w:color w:val="0F766E"/>
+          <w:sz w:val="32"/>
+        </w:rPr>
+        <w:t>• 1. ทำความสะอาดอุปกรณ์:</w:t>
+      </w:r>
+      <w:r>
+        <w:rPr>
+          <w:rFonts w:ascii="TH Sarabun PSK" w:hAnsi="TH Sarabun PSK" w:cs="TH Sarabun PSK"/>
+          <w:b w:val="0"/>
+          <w:i w:val="0"/>
+          <w:sz w:val="32"/>
+        </w:rPr>
+        <w:t xml:space="preserve"> เช็ดทำความสะอาดอุปกรณ์และจัดเก็บเข้ากล่องบรรจุให้เรียบร้อยตามตำแหน่งเดิม</w:t>
+      </w:r>
+    </w:p>
+    <w:p>
+      <w:pPr>
+        <w:spacing w:after="80"/>
+      </w:pPr>
+      <w:r>
+        <w:rPr>
+          <w:rFonts w:ascii="TH Sarabun PSK" w:hAnsi="TH Sarabun PSK" w:cs="TH Sarabun PSK"/>
+          <w:b/>
+          <w:i w:val="0"/>
+          <w:color w:val="0F766E"/>
+          <w:sz w:val="32"/>
+        </w:rPr>
+        <w:t>• 2. นำส่งคืน ณ เคาน์เตอร์แล็บ:</w:t>
+      </w:r>
+      <w:r>
+        <w:rPr>
+          <w:rFonts w:ascii="TH Sarabun PSK" w:hAnsi="TH Sarabun PSK" w:cs="TH Sarabun PSK"/>
+          <w:b w:val="0"/>
+          <w:i w:val="0"/>
+          <w:sz w:val="32"/>
+        </w:rPr>
+        <w:t xml:space="preserve"> ส่งคืนอุปกรณ์ตามวัน-เวลาที่กำหนดในระบบ</w:t>
+      </w:r>
+    </w:p>
+    <w:p>
+      <w:pPr>
+        <w:spacing w:after="80"/>
+      </w:pPr>
+      <w:r>
+        <w:rPr>
+          <w:rFonts w:ascii="TH Sarabun PSK" w:hAnsi="TH Sarabun PSK" w:cs="TH Sarabun PSK"/>
+          <w:b/>
+          <w:i w:val="0"/>
+          <w:color w:val="0F766E"/>
+          <w:sz w:val="32"/>
+        </w:rPr>
+        <w:t>• 3. ตรวจรับและปิดสถานะ:</w:t>
+      </w:r>
+      <w:r>
+        <w:rPr>
+          <w:rFonts w:ascii="TH Sarabun PSK" w:hAnsi="TH Sarabun PSK" w:cs="TH Sarabun PSK"/>
+          <w:b w:val="0"/>
+          <w:i w:val="0"/>
+          <w:sz w:val="32"/>
+        </w:rPr>
+        <w:t xml:space="preserve"> เจ้าหน้าที่แล็บตรวจนับความสมบูรณ์และกดรับคืน สถานะเปลี่ยนเป็น RETURNED</w:t>
+      </w:r>
+    </w:p>
+    <w:p>
+      <w:pPr>
+        <w:spacing w:after="80"/>
+      </w:pPr>
+      <w:r>
+        <w:rPr>
+          <w:rFonts w:ascii="TH Sarabun PSK" w:hAnsi="TH Sarabun PSK" w:cs="TH Sarabun PSK"/>
+          <w:b/>
+          <w:i w:val="0"/>
+          <w:color w:val="0F766E"/>
+          <w:sz w:val="32"/>
+        </w:rPr>
+        <w:t>• 4. กรณีชำรุดหรือสูญหาย:</w:t>
+      </w:r>
+      <w:r>
+        <w:rPr>
+          <w:rFonts w:ascii="TH Sarabun PSK" w:hAnsi="TH Sarabun PSK" w:cs="TH Sarabun PSK"/>
+          <w:b w:val="0"/>
+          <w:i w:val="0"/>
+          <w:sz w:val="32"/>
+        </w:rPr>
+        <w:t xml:space="preserve"> ให้รีบแจ้งเจ้าหน้าที่ทันทีเพื่อบันทึกประวัติการส่งซ่อมบำรุงตามระเบียบ</w:t>
       </w:r>
     </w:p>
     <w:sectPr>
@@ -1747,9 +2273,9 @@
     <w:qFormat/>
     <w:rsid w:val="00FC693F"/>
     <w:rPr>
-      <w:rFonts w:ascii="Sarabun" w:hAnsi="Sarabun"/>
+      <w:rFonts w:ascii="TH Sarabun PSK" w:hAnsi="TH Sarabun PSK" w:cs="TH Sarabun PSK"/>
       <w:color w:val="0F172A"/>
-      <w:sz w:val="24"/>
+      <w:sz w:val="32"/>
     </w:rPr>
   </w:style>
   <w:style w:type="paragraph" w:styleId="Header">

</xml_diff>

<commit_message>
docs: update student user manual with real overview, straight flowcharts, and 16pt TH Sarabun PSK
</commit_message>
<xml_diff>
--- a/manual/student_user_manual.docx
+++ b/manual/student_user_manual.docx
@@ -235,7 +235,7 @@
           <w:i w:val="0"/>
           <w:sz w:val="30"/>
         </w:rPr>
-        <w:t xml:space="preserve">บทที่ 3: ขั้นตอนการยืม-เบิก One-Stop จากระบบจริง (ชี้จุดที่ 1 ถึง 7) </w:t>
+        <w:t xml:space="preserve">บทที่ 3: ภาพรวมรายการคำขอและขั้นตอนการยืม-เบิก One-Stop (ชี้จุดที่ 1 ถึง 7) </w:t>
       </w:r>
       <w:r>
         <w:rPr>
@@ -1030,7 +1030,143 @@
           <w:color w:val="64748B"/>
           <w:sz w:val="28"/>
         </w:rPr>
-        <w:t>ผังงานที่ 2: ขั้นตอนการยืม-เบิก One-Stop พร้อมเงื่อนไขตรวจสอบความปลอดภัย (เส้นตรงมาตรฐาน)</w:t>
+        <w:t>ผังงานที่ 2: ขั้นตอนการยืม-เบิก One-Stop พร้อมเงื่อนไขตรวจสอบความปลอดภัยคนจริง/หุ่น (เส้นตรงมาตรฐาน ISO 5807)</w:t>
+      </w:r>
+    </w:p>
+    <w:p/>
+    <w:p>
+      <w:r>
+        <w:rPr>
+          <w:rFonts w:ascii="TH Sarabun PSK" w:hAnsi="TH Sarabun PSK" w:cs="TH Sarabun PSK"/>
+          <w:b/>
+          <w:i w:val="0"/>
+          <w:color w:val="0F766E"/>
+          <w:sz w:val="32"/>
+        </w:rPr>
+        <w:t>คำอธิบายขั้นตอนการทำงานของผังงานที่ 2:</w:t>
+      </w:r>
+    </w:p>
+    <w:p>
+      <w:pPr>
+        <w:spacing w:after="80"/>
+      </w:pPr>
+      <w:r>
+        <w:rPr>
+          <w:rFonts w:ascii="TH Sarabun PSK" w:hAnsi="TH Sarabun PSK" w:cs="TH Sarabun PSK"/>
+          <w:b/>
+          <w:i w:val="0"/>
+          <w:color w:val="0284C7"/>
+          <w:sz w:val="32"/>
+        </w:rPr>
+        <w:t xml:space="preserve">  • 1. เลือกรหัสรายวิชา:</w:t>
+      </w:r>
+      <w:r>
+        <w:rPr>
+          <w:rFonts w:ascii="TH Sarabun PSK" w:hAnsi="TH Sarabun PSK" w:cs="TH Sarabun PSK"/>
+          <w:b w:val="0"/>
+          <w:i w:val="0"/>
+          <w:sz w:val="32"/>
+        </w:rPr>
+        <w:t xml:space="preserve"> เลือกรหัสวิชา ระบบจะดึงชื่ออาจารย์ผู้รับผิดชอบรายวิชาให้อัตโนมัติทันที</w:t>
+      </w:r>
+    </w:p>
+    <w:p>
+      <w:pPr>
+        <w:spacing w:after="80"/>
+      </w:pPr>
+      <w:r>
+        <w:rPr>
+          <w:rFonts w:ascii="TH Sarabun PSK" w:hAnsi="TH Sarabun PSK" w:cs="TH Sarabun PSK"/>
+          <w:b/>
+          <w:i w:val="0"/>
+          <w:color w:val="0284C7"/>
+          <w:sz w:val="32"/>
+        </w:rPr>
+        <w:t xml:space="preserve">  • 2. ระบุวัน-เวลานัดหมายรับและส่งคืน:</w:t>
+      </w:r>
+      <w:r>
+        <w:rPr>
+          <w:rFonts w:ascii="TH Sarabun PSK" w:hAnsi="TH Sarabun PSK" w:cs="TH Sarabun PSK"/>
+          <w:b w:val="0"/>
+          <w:i w:val="0"/>
+          <w:sz w:val="32"/>
+        </w:rPr>
+        <w:t xml:space="preserve"> กำหนดวันเวลาที่มารับของ และกำหนดส่งคืน พร้อมระบุสถานที่และหัตถการ</w:t>
+      </w:r>
+    </w:p>
+    <w:p>
+      <w:pPr>
+        <w:spacing w:after="80"/>
+      </w:pPr>
+      <w:r>
+        <w:rPr>
+          <w:rFonts w:ascii="TH Sarabun PSK" w:hAnsi="TH Sarabun PSK" w:cs="TH Sarabun PSK"/>
+          <w:b/>
+          <w:i w:val="0"/>
+          <w:color w:val="0284C7"/>
+          <w:sz w:val="32"/>
+        </w:rPr>
+        <w:t xml:space="preserve">  • 3. เลือกรายการครุภัณฑ์และเวชภัณฑ์:</w:t>
+      </w:r>
+      <w:r>
+        <w:rPr>
+          <w:rFonts w:ascii="TH Sarabun PSK" w:hAnsi="TH Sarabun PSK" w:cs="TH Sarabun PSK"/>
+          <w:b w:val="0"/>
+          <w:i w:val="0"/>
+          <w:sz w:val="32"/>
+        </w:rPr>
+        <w:t xml:space="preserve"> ค้นหาและระบุจำนวนอุปกรณ์ที่ต้องการยืมและเวชภัณฑ์ที่ขอเบิก</w:t>
+      </w:r>
+    </w:p>
+    <w:p>
+      <w:pPr>
+        <w:spacing w:after="80"/>
+      </w:pPr>
+      <w:r>
+        <w:rPr>
+          <w:rFonts w:ascii="TH Sarabun PSK" w:hAnsi="TH Sarabun PSK" w:cs="TH Sarabun PSK"/>
+          <w:b/>
+          <w:i w:val="0"/>
+          <w:color w:val="0284C7"/>
+          <w:sz w:val="32"/>
+        </w:rPr>
+        <w:t xml:space="preserve">  • 4. ตรวจสอบเงื่อนไข Patient Safety Lock:</w:t>
+      </w:r>
+      <w:r>
+        <w:rPr>
+          <w:rFonts w:ascii="TH Sarabun PSK" w:hAnsi="TH Sarabun PSK" w:cs="TH Sarabun PSK"/>
+          <w:b w:val="0"/>
+          <w:i w:val="0"/>
+          <w:sz w:val="32"/>
+        </w:rPr>
+        <w:br/>
+        <w:t xml:space="preserve">     • กรณีใช้งานกับคนจริง / คลินิก: ระบบจะบล็อกเวชภัณฑ์ล็อตหมดอายุ 100% ตรวจสอบเฉพาะล็อตที่ยังไม่หมดอายุ หากไม่พอจะปฏิเสธคำขอทันทีเพื่อความปลอดภัยของผู้ป่วย</w:t>
+        <w:br/>
+        <w:t xml:space="preserve">     • กรณีฝึกปฏิบัติกับหุ่นจำลอง (Sim-Lab): ระบบอนุญาตให้ใช้เวชภัณฑ์หมดอายุได้เพื่อประหยัดงบประมาณ โดยตรวจสอบยอดสต็อกรวม</w:t>
+      </w:r>
+    </w:p>
+    <w:p>
+      <w:pPr>
+        <w:spacing w:after="80"/>
+      </w:pPr>
+      <w:r>
+        <w:rPr>
+          <w:rFonts w:ascii="TH Sarabun PSK" w:hAnsi="TH Sarabun PSK" w:cs="TH Sarabun PSK"/>
+          <w:b/>
+          <w:i w:val="0"/>
+          <w:color w:val="0284C7"/>
+          <w:sz w:val="32"/>
+        </w:rPr>
+        <w:t xml:space="preserve">  • 5. ส่งคำขอและอนุมัติ:</w:t>
+      </w:r>
+      <w:r>
+        <w:rPr>
+          <w:rFonts w:ascii="TH Sarabun PSK" w:hAnsi="TH Sarabun PSK" w:cs="TH Sarabun PSK"/>
+          <w:b w:val="0"/>
+          <w:i w:val="0"/>
+          <w:sz w:val="32"/>
+        </w:rPr>
+        <w:t xml:space="preserve"> แจ้งเตือนอาจารย์รับทราบ และส่งให้เจ้าหน้าที่ห้องปฏิบัติการตรวจสอบอนุมัติและจ่ายพัสดุ</w:t>
       </w:r>
     </w:p>
     <w:p>
@@ -1115,7 +1251,7 @@
           <w:color w:val="0F766E"/>
           <w:sz w:val="40"/>
         </w:rPr>
-        <w:t>บทที่ 3: ขั้นตอนการยืม-เบิกอุปกรณ์แบบ One-Stop (ภาพจากระบบจริง)</w:t>
+        <w:t>บทที่ 3: ภาพรวมรายการคำขอและขั้นตอนการยืม-เบิก One-Stop (ภาพจากระบบจริง)</w:t>
       </w:r>
     </w:p>
     <w:p>
@@ -1126,7 +1262,179 @@
           <w:i w:val="0"/>
           <w:sz w:val="32"/>
         </w:rPr>
-        <w:t>เมื่อกดปุ่ม '+ ขอยืม-เบิกอุปกรณ์ (One-Stop)' ระบบจะเปิดหน้าต่างฟอร์มรวมดังรูปที่ 3.1 ให้นิสิตกรอกข้อมูลตามหมายเลขกำกับในแต่ละช่องดังนี้:</w:t>
+        <w:t>เมื่อนิสิตเข้าสู่เมนู 'ยืม-คืนอุปกรณ์' ระบบจะแสดงหน้าจอภาพรวม (Overview Dashboard) แสดงรายการประวัติคำขอของนิสิตพร้อมสถานะแบบเรียลไทม์ ดังแสดงในรูปที่ 3.1:</w:t>
+      </w:r>
+    </w:p>
+    <w:p>
+      <w:r>
+        <w:drawing>
+          <wp:inline xmlns:a="http://schemas.openxmlformats.org/drawingml/2006/main" xmlns:pic="http://schemas.openxmlformats.org/drawingml/2006/picture">
+            <wp:extent cx="5303520" cy="4419600"/>
+            <wp:docPr id="5" name="Picture 5"/>
+            <wp:cNvGraphicFramePr>
+              <a:graphicFrameLocks noChangeAspect="1"/>
+            </wp:cNvGraphicFramePr>
+            <a:graphic>
+              <a:graphicData uri="http://schemas.openxmlformats.org/drawingml/2006/picture">
+                <pic:pic>
+                  <pic:nvPicPr>
+                    <pic:cNvPr id="0" name="overview_student_dashboard_annotated.png"/>
+                    <pic:cNvPicPr/>
+                  </pic:nvPicPr>
+                  <pic:blipFill>
+                    <a:blip r:embed="rId13"/>
+                    <a:stretch>
+                      <a:fillRect/>
+                    </a:stretch>
+                  </pic:blipFill>
+                  <pic:spPr>
+                    <a:xfrm>
+                      <a:off x="0" y="0"/>
+                      <a:ext cx="5303520" cy="4419600"/>
+                    </a:xfrm>
+                    <a:prstGeom prst="rect"/>
+                  </pic:spPr>
+                </pic:pic>
+              </a:graphicData>
+            </a:graphic>
+          </wp:inline>
+        </w:drawing>
+      </w:r>
+    </w:p>
+    <w:p>
+      <w:pPr>
+        <w:jc w:val="center"/>
+      </w:pPr>
+      <w:r>
+        <w:rPr>
+          <w:rFonts w:ascii="TH Sarabun PSK" w:hAnsi="TH Sarabun PSK" w:cs="TH Sarabun PSK"/>
+          <w:b w:val="0"/>
+          <w:i/>
+          <w:color w:val="64748B"/>
+          <w:sz w:val="28"/>
+        </w:rPr>
+        <w:t>รูปที่ 3.1: ภาพจากระบบจริง - ภาพรวมรายการคำขอยืม-คืนของนิสิต (Overview Dashboard พร้อมข้อมูลคำขอจริงและปุ่ม One-Stop)</w:t>
+      </w:r>
+    </w:p>
+    <w:p/>
+    <w:p>
+      <w:r>
+        <w:rPr>
+          <w:rFonts w:ascii="TH Sarabun PSK" w:hAnsi="TH Sarabun PSK" w:cs="TH Sarabun PSK"/>
+          <w:b/>
+          <w:i w:val="0"/>
+          <w:color w:val="0F766E"/>
+          <w:sz w:val="32"/>
+        </w:rPr>
+        <w:t>สถานะของคำขอในหน้าภาพรวม ประกอบด้วย 4 สถานะหลัก:</w:t>
+      </w:r>
+    </w:p>
+    <w:p>
+      <w:pPr>
+        <w:spacing w:after="80"/>
+      </w:pPr>
+      <w:r>
+        <w:rPr>
+          <w:rFonts w:ascii="TH Sarabun PSK" w:hAnsi="TH Sarabun PSK" w:cs="TH Sarabun PSK"/>
+          <w:b/>
+          <w:i w:val="0"/>
+          <w:color w:val="0284C7"/>
+          <w:sz w:val="32"/>
+        </w:rPr>
+        <w:t xml:space="preserve">  • รออนุมัติ (PENDING):</w:t>
+      </w:r>
+      <w:r>
+        <w:rPr>
+          <w:rFonts w:ascii="TH Sarabun PSK" w:hAnsi="TH Sarabun PSK" w:cs="TH Sarabun PSK"/>
+          <w:b w:val="0"/>
+          <w:i w:val="0"/>
+          <w:sz w:val="32"/>
+        </w:rPr>
+        <w:t xml:space="preserve"> คำขอถูกส่งแล้ว อยู่ระหว่างรออาจารย์ประจำวิชารับทราบ และเจ้าหน้าที่ตรวจสอบความถูกต้อง</w:t>
+      </w:r>
+    </w:p>
+    <w:p>
+      <w:pPr>
+        <w:spacing w:after="80"/>
+      </w:pPr>
+      <w:r>
+        <w:rPr>
+          <w:rFonts w:ascii="TH Sarabun PSK" w:hAnsi="TH Sarabun PSK" w:cs="TH Sarabun PSK"/>
+          <w:b/>
+          <w:i w:val="0"/>
+          <w:color w:val="0284C7"/>
+          <w:sz w:val="32"/>
+        </w:rPr>
+        <w:t xml:space="preserve">  • อนุมัติแล้ว (APPROVED):</w:t>
+      </w:r>
+      <w:r>
+        <w:rPr>
+          <w:rFonts w:ascii="TH Sarabun PSK" w:hAnsi="TH Sarabun PSK" w:cs="TH Sarabun PSK"/>
+          <w:b w:val="0"/>
+          <w:i w:val="0"/>
+          <w:sz w:val="32"/>
+        </w:rPr>
+        <w:t xml:space="preserve"> คำขอผ่านการอนุมัติแล้ว นิสิตสามารถเดินทางมารับอุปกรณ์ได้ตามวัน-เวลาที่นัดหมาย</w:t>
+      </w:r>
+    </w:p>
+    <w:p>
+      <w:pPr>
+        <w:spacing w:after="80"/>
+      </w:pPr>
+      <w:r>
+        <w:rPr>
+          <w:rFonts w:ascii="TH Sarabun PSK" w:hAnsi="TH Sarabun PSK" w:cs="TH Sarabun PSK"/>
+          <w:b/>
+          <w:i w:val="0"/>
+          <w:color w:val="0284C7"/>
+          <w:sz w:val="32"/>
+        </w:rPr>
+        <w:t xml:space="preserve">  • รับอุปกรณ์แล้ว (DISPENSED):</w:t>
+      </w:r>
+      <w:r>
+        <w:rPr>
+          <w:rFonts w:ascii="TH Sarabun PSK" w:hAnsi="TH Sarabun PSK" w:cs="TH Sarabun PSK"/>
+          <w:b w:val="0"/>
+          <w:i w:val="0"/>
+          <w:sz w:val="32"/>
+        </w:rPr>
+        <w:t xml:space="preserve"> นิสิตรับอุปกรณ์ไปใช้งานในการเรียนการสอนแล้ว โดยต้องนำมาส่งคืนตามกำหนด</w:t>
+      </w:r>
+    </w:p>
+    <w:p>
+      <w:pPr>
+        <w:spacing w:after="80"/>
+      </w:pPr>
+      <w:r>
+        <w:rPr>
+          <w:rFonts w:ascii="TH Sarabun PSK" w:hAnsi="TH Sarabun PSK" w:cs="TH Sarabun PSK"/>
+          <w:b/>
+          <w:i w:val="0"/>
+          <w:color w:val="0284C7"/>
+          <w:sz w:val="32"/>
+        </w:rPr>
+        <w:t xml:space="preserve">  • คืนแล้ว (RETURNED):</w:t>
+      </w:r>
+      <w:r>
+        <w:rPr>
+          <w:rFonts w:ascii="TH Sarabun PSK" w:hAnsi="TH Sarabun PSK" w:cs="TH Sarabun PSK"/>
+          <w:b w:val="0"/>
+          <w:i w:val="0"/>
+          <w:sz w:val="32"/>
+        </w:rPr>
+        <w:t xml:space="preserve"> ครุภัณฑ์ได้รับการส่งคืนและเจ้าหน้าที่ตรวจรับความเรียบร้อยสมบูรณ์แล้ว</w:t>
+      </w:r>
+    </w:p>
+    <w:p/>
+    <w:p>
+      <w:r>
+        <w:rPr>
+          <w:rFonts w:ascii="TH Sarabun PSK" w:hAnsi="TH Sarabun PSK" w:cs="TH Sarabun PSK"/>
+          <w:b w:val="0"/>
+          <w:i w:val="0"/>
+          <w:sz w:val="32"/>
+        </w:rPr>
+        <w:t>เมื่อต้องการยืม-เบิกอุปกรณ์ ให้กดปุ่ม '+ ขอยืม-เบิกอุปกรณ์ (One-Stop)' ที่มุมขวาบนของหน้าจอ ระบบจะเปิดหน้าต่างฟอร์มรวม ดังแสดงในรูปที่ 3.2 ให้นิสิตกรอกข้อมูลตามหมายเลขกำกับจุดที่ 1 ถึง 7:</w:t>
       </w:r>
     </w:p>
     <w:p>
@@ -1134,7 +1442,7 @@
         <w:drawing>
           <wp:inline xmlns:a="http://schemas.openxmlformats.org/drawingml/2006/main" xmlns:pic="http://schemas.openxmlformats.org/drawingml/2006/picture">
             <wp:extent cx="5303520" cy="4051300"/>
-            <wp:docPr id="5" name="Picture 5"/>
+            <wp:docPr id="6" name="Picture 6"/>
             <wp:cNvGraphicFramePr>
               <a:graphicFrameLocks noChangeAspect="1"/>
             </wp:cNvGraphicFramePr>
@@ -1146,7 +1454,7 @@
                     <pic:cNvPicPr/>
                   </pic:nvPicPr>
                   <pic:blipFill>
-                    <a:blip r:embed="rId13"/>
+                    <a:blip r:embed="rId14"/>
                     <a:stretch>
                       <a:fillRect/>
                     </a:stretch>
@@ -1177,7 +1485,7 @@
           <w:color w:val="64748B"/>
           <w:sz w:val="28"/>
         </w:rPr>
-        <w:t>รูปที่ 3.1: ภาพจากระบบจริง - ชี้ตำแหน่งและสิ่งที่ต้องกรอกในแต่ละช่อง (จุดที่ 1 ถึง 7)</w:t>
+        <w:t>รูปที่ 3.2: ภาพจากระบบจริง - ชี้ตำแหน่งและสิ่งที่ต้องกรอกในแต่ละช่อง (จุดที่ 1 ถึง 7)</w:t>
       </w:r>
     </w:p>
     <w:p/>
@@ -1407,7 +1715,7 @@
         <w:drawing>
           <wp:inline xmlns:a="http://schemas.openxmlformats.org/drawingml/2006/main" xmlns:pic="http://schemas.openxmlformats.org/drawingml/2006/picture">
             <wp:extent cx="5303520" cy="4051300"/>
-            <wp:docPr id="6" name="Picture 6"/>
+            <wp:docPr id="7" name="Picture 7"/>
             <wp:cNvGraphicFramePr>
               <a:graphicFrameLocks noChangeAspect="1"/>
             </wp:cNvGraphicFramePr>
@@ -1419,7 +1727,7 @@
                     <pic:cNvPicPr/>
                   </pic:nvPicPr>
                   <pic:blipFill>
-                    <a:blip r:embed="rId14"/>
+                    <a:blip r:embed="rId15"/>
                     <a:stretch>
                       <a:fillRect/>
                     </a:stretch>
@@ -1534,7 +1842,7 @@
         <w:drawing>
           <wp:inline xmlns:a="http://schemas.openxmlformats.org/drawingml/2006/main" xmlns:pic="http://schemas.openxmlformats.org/drawingml/2006/picture">
             <wp:extent cx="5303520" cy="4051300"/>
-            <wp:docPr id="7" name="Picture 7"/>
+            <wp:docPr id="8" name="Picture 8"/>
             <wp:cNvGraphicFramePr>
               <a:graphicFrameLocks noChangeAspect="1"/>
             </wp:cNvGraphicFramePr>
@@ -1546,7 +1854,7 @@
                     <pic:cNvPicPr/>
                   </pic:nvPicPr>
                   <pic:blipFill>
-                    <a:blip r:embed="rId15"/>
+                    <a:blip r:embed="rId16"/>
                     <a:stretch>
                       <a:fillRect/>
                     </a:stretch>
@@ -1585,7 +1893,7 @@
         <w:drawing>
           <wp:inline xmlns:a="http://schemas.openxmlformats.org/drawingml/2006/main" xmlns:pic="http://schemas.openxmlformats.org/drawingml/2006/picture">
             <wp:extent cx="3474720" cy="4169664"/>
-            <wp:docPr id="8" name="Picture 8"/>
+            <wp:docPr id="9" name="Picture 9"/>
             <wp:cNvGraphicFramePr>
               <a:graphicFrameLocks noChangeAspect="1"/>
             </wp:cNvGraphicFramePr>
@@ -1597,7 +1905,7 @@
                     <pic:cNvPicPr/>
                   </pic:nvPicPr>
                   <pic:blipFill>
-                    <a:blip r:embed="rId16"/>
+                    <a:blip r:embed="rId17"/>
                     <a:stretch>
                       <a:fillRect/>
                     </a:stretch>

</xml_diff>

<commit_message>
docs: add Student Main Dashboard chapter and fix Flowchart 2 Mermaid syntax error
</commit_message>
<xml_diff>
--- a/manual/student_user_manual.docx
+++ b/manual/student_user_manual.docx
@@ -235,7 +235,7 @@
           <w:i w:val="0"/>
           <w:sz w:val="30"/>
         </w:rPr>
-        <w:t xml:space="preserve">บทที่ 3: ภาพรวมรายการคำขอและขั้นตอนการยืม-เบิก One-Stop (ชี้จุดที่ 1 ถึง 7) </w:t>
+        <w:t>บทที่ 3: หน้าจอแดชบอร์ดหลักของนิสิต (Student Main Dashboard) ....</w:t>
       </w:r>
       <w:r>
         <w:rPr>
@@ -258,7 +258,7 @@
           <w:i w:val="0"/>
           <w:sz w:val="30"/>
         </w:rPr>
-        <w:t xml:space="preserve">บทที่ 4: การขอเบิกชุดฝึกปฏิบัติการสำเร็จรูป (Nursing Practice Kits) </w:t>
+        <w:t xml:space="preserve">บทที่ 4: ภาพรวมรายการคำขอและขั้นตอนการยืม-เบิก One-Stop (ชี้จุด 1-7) </w:t>
       </w:r>
       <w:r>
         <w:rPr>
@@ -281,7 +281,7 @@
           <w:i w:val="0"/>
           <w:sz w:val="30"/>
         </w:rPr>
-        <w:t xml:space="preserve">บทที่ 5: การขอเข้าฝึกปฏิบัติการด้วยตนเองและสแกน QR Code Check-in </w:t>
+        <w:t xml:space="preserve">บทที่ 5: การขอเบิกชุดฝึกปฏิบัติการสำเร็จรูป (Nursing Practice Kits) </w:t>
       </w:r>
       <w:r>
         <w:rPr>
@@ -290,7 +290,7 @@
           <w:i w:val="0"/>
           <w:sz w:val="30"/>
         </w:rPr>
-        <w:t xml:space="preserve"> หน้า 11</w:t>
+        <w:t xml:space="preserve"> หน้า 12</w:t>
       </w:r>
     </w:p>
     <w:p>
@@ -304,7 +304,7 @@
           <w:i w:val="0"/>
           <w:sz w:val="30"/>
         </w:rPr>
-        <w:t xml:space="preserve">บทที่ 6: การส่งคืนอุปกรณ์และข้อพึงระวังความปลอดภัย (Safety Rules) </w:t>
+        <w:t xml:space="preserve">บทที่ 6: การขอเข้าฝึกปฏิบัติการด้วยตนเองและสแกน QR Code Check-in </w:t>
       </w:r>
       <w:r>
         <w:rPr>
@@ -314,6 +314,29 @@
           <w:sz w:val="30"/>
         </w:rPr>
         <w:t xml:space="preserve"> หน้า 13</w:t>
+      </w:r>
+    </w:p>
+    <w:p>
+      <w:pPr>
+        <w:spacing w:after="80"/>
+      </w:pPr>
+      <w:r>
+        <w:rPr>
+          <w:rFonts w:ascii="TH Sarabun PSK" w:hAnsi="TH Sarabun PSK" w:cs="TH Sarabun PSK"/>
+          <w:b w:val="0"/>
+          <w:i w:val="0"/>
+          <w:sz w:val="30"/>
+        </w:rPr>
+        <w:t xml:space="preserve">บทที่ 7: การส่งคืนอุปกรณ์และข้อพึงระวังความปลอดภัย (Safety Rules) </w:t>
+      </w:r>
+      <w:r>
+        <w:rPr>
+          <w:rFonts w:ascii="TH Sarabun PSK" w:hAnsi="TH Sarabun PSK" w:cs="TH Sarabun PSK"/>
+          <w:b/>
+          <w:i w:val="0"/>
+          <w:sz w:val="30"/>
+        </w:rPr>
+        <w:t xml:space="preserve"> หน้า 15</w:t>
       </w:r>
     </w:p>
     <w:p>
@@ -986,7 +1009,7 @@
       <w:r>
         <w:drawing>
           <wp:inline xmlns:a="http://schemas.openxmlformats.org/drawingml/2006/main" xmlns:pic="http://schemas.openxmlformats.org/drawingml/2006/picture">
-            <wp:extent cx="5303520" cy="1147833"/>
+            <wp:extent cx="5303520" cy="5591425"/>
             <wp:docPr id="3" name="Picture 3"/>
             <wp:cNvGraphicFramePr>
               <a:graphicFrameLocks noChangeAspect="1"/>
@@ -1007,7 +1030,7 @@
                   <pic:spPr>
                     <a:xfrm>
                       <a:off x="0" y="0"/>
-                      <a:ext cx="5303520" cy="1147833"/>
+                      <a:ext cx="5303520" cy="5591425"/>
                     </a:xfrm>
                     <a:prstGeom prst="rect"/>
                   </pic:spPr>
@@ -1140,7 +1163,7 @@
           <w:sz w:val="32"/>
         </w:rPr>
         <w:br/>
-        <w:t xml:space="preserve">     • กรณีใช้งานกับคนจริง / คลินิก: ระบบจะบล็อกเวชภัณฑ์ล็อตหมดอายุ 100% ตรวจสอบเฉพาะล็อตที่ยังไม่หมดอายุ หากไม่พอจะปฏิเสธคำขอทันทีเพื่อความปลอดภัยของผู้ป่วย</w:t>
+        <w:t xml:space="preserve">     • กรณีใช้งานกับคนจริง / คลินิก: ระบบจะบล็อกเวชภัณฑ์ล็อตหมดอายุ 100% ตรวจเฉพาะล็อตที่ยังไม่หมดอายุ หากไม่พอจะปฏิเสธคำขอทันทีเพื่อความปลอดภัยของผู้ป่วย</w:t>
         <w:br/>
         <w:t xml:space="preserve">     • กรณีฝึกปฏิบัติกับหุ่นจำลอง (Sim-Lab): ระบบอนุญาตให้ใช้เวชภัณฑ์หมดอายุได้เพื่อประหยัดงบประมาณ โดยตรวจสอบยอดสต็อกรวม</w:t>
       </w:r>
@@ -1251,7 +1274,7 @@
           <w:color w:val="0F766E"/>
           <w:sz w:val="40"/>
         </w:rPr>
-        <w:t>บทที่ 3: ภาพรวมรายการคำขอและขั้นตอนการยืม-เบิก One-Stop (ภาพจากระบบจริง)</w:t>
+        <w:t>บทที่ 3: หน้าจอแดชบอร์ดหลักของนิสิต (Student Main Dashboard)</w:t>
       </w:r>
     </w:p>
     <w:p>
@@ -1262,7 +1285,7 @@
           <w:i w:val="0"/>
           <w:sz w:val="32"/>
         </w:rPr>
-        <w:t>เมื่อนิสิตเข้าสู่เมนู 'ยืม-คืนอุปกรณ์' ระบบจะแสดงหน้าจอภาพรวม (Overview Dashboard) แสดงรายการประวัติคำขอของนิสิตพร้อมสถานะแบบเรียลไทม์ ดังแสดงในรูปที่ 3.1:</w:t>
+        <w:t>เมื่อนิสิตเข้าสู่ระบบ หน้าจอแรกที่จะปรากฏคือ 'หน้าจอแดชบอร์ดหลักของนิสิต' ซึ่งรวบรวมข้อมูลสถานะการยืม แจ้งเตือนกำหนดวันส่งคืน และสถิติชั่วโมงฝึกซ้อมสะสม ดังแสดงในรูปที่ 3.1:</w:t>
       </w:r>
     </w:p>
     <w:p>
@@ -1278,7 +1301,7 @@
               <a:graphicData uri="http://schemas.openxmlformats.org/drawingml/2006/picture">
                 <pic:pic>
                   <pic:nvPicPr>
-                    <pic:cNvPr id="0" name="overview_student_dashboard_annotated.png"/>
+                    <pic:cNvPr id="0" name="student_main_dashboard_annotated.png"/>
                     <pic:cNvPicPr/>
                   </pic:nvPicPr>
                   <pic:blipFill>
@@ -1313,7 +1336,205 @@
           <w:color w:val="64748B"/>
           <w:sz w:val="28"/>
         </w:rPr>
-        <w:t>รูปที่ 3.1: ภาพจากระบบจริง - ภาพรวมรายการคำขอยืม-คืนของนิสิต (Overview Dashboard พร้อมข้อมูลคำขอจริงและปุ่ม One-Stop)</w:t>
+        <w:t>รูปที่ 3.1: ภาพจากระบบจริง - หน้าแดชบอร์ดหลักของนิสิต พร้อมป้ายกำกับจุดสำคัญ (จุดที่ 1 ถึง 4)</w:t>
+      </w:r>
+    </w:p>
+    <w:p/>
+    <w:p>
+      <w:r>
+        <w:rPr>
+          <w:rFonts w:ascii="TH Sarabun PSK" w:hAnsi="TH Sarabun PSK" w:cs="TH Sarabun PSK"/>
+          <w:b/>
+          <w:i w:val="0"/>
+          <w:color w:val="0F766E"/>
+          <w:sz w:val="36"/>
+        </w:rPr>
+        <w:t>รายละเอียดองค์ประกอบในหน้าแดชบอร์ดหลัก (อธิบายตามหมายเลข):</w:t>
+      </w:r>
+    </w:p>
+    <w:p>
+      <w:pPr>
+        <w:spacing w:after="120"/>
+      </w:pPr>
+      <w:r>
+        <w:rPr>
+          <w:rFonts w:ascii="TH Sarabun PSK" w:hAnsi="TH Sarabun PSK" w:cs="TH Sarabun PSK"/>
+          <w:b/>
+          <w:i w:val="0"/>
+          <w:color w:val="0F766E"/>
+          <w:sz w:val="32"/>
+        </w:rPr>
+        <w:t>• จุดที่ 1: แถบข้อมูลนิสิตและปุ่มทางลัด (Student Header &amp; Quick Actions)</w:t>
+        <w:br/>
+      </w:r>
+      <w:r>
+        <w:rPr>
+          <w:rFonts w:ascii="TH Sarabun PSK" w:hAnsi="TH Sarabun PSK" w:cs="TH Sarabun PSK"/>
+          <w:b w:val="0"/>
+          <w:i w:val="0"/>
+          <w:sz w:val="32"/>
+        </w:rPr>
+        <w:t>แสดงชื่อ-นามสกุล, รหัสนิสิต (เช่น 6811700661), สาขาวิชาพยาบาลศาสตร์, และภาคเรียนปัจจุบัน พร้อมปุ่มทางลัดด่วน 'ยื่นขอยืมอุปกรณ์ฝึกซ้อม' และ 'ขอเบิกวัสดุฝึกปฏิบัติ' ที่ช่วยให้นิสิตเข้าถึงฟอร์มทำรายการได้ทันที</w:t>
+      </w:r>
+    </w:p>
+    <w:p>
+      <w:pPr>
+        <w:spacing w:after="120"/>
+      </w:pPr>
+      <w:r>
+        <w:rPr>
+          <w:rFonts w:ascii="TH Sarabun PSK" w:hAnsi="TH Sarabun PSK" w:cs="TH Sarabun PSK"/>
+          <w:b/>
+          <w:i w:val="0"/>
+          <w:color w:val="0F766E"/>
+          <w:sz w:val="32"/>
+        </w:rPr>
+        <w:t>• จุดที่ 2: การ์ดสรุปสถานะสำคัญ 4 ด้าน (4 Summary KPI Cards)</w:t>
+        <w:br/>
+      </w:r>
+      <w:r>
+        <w:rPr>
+          <w:rFonts w:ascii="TH Sarabun PSK" w:hAnsi="TH Sarabun PSK" w:cs="TH Sarabun PSK"/>
+          <w:b w:val="0"/>
+          <w:i w:val="0"/>
+          <w:sz w:val="32"/>
+        </w:rPr>
+        <w:t xml:space="preserve">  • กำลังยืมอยู่ขณะนี้: แสดงจำนวนคำขอที่มีอุปกรณ์อยู่ในความรับผิดชอบของนิสิตจริง</w:t>
+        <w:br/>
+        <w:t xml:space="preserve">  • คำขอที่รออนุมัติ: แสดงจำนวนรายการที่นิสิตส่งคำขอแล้ว และกำลังรออาจารย์/เจ้าหน้าที่ตรวจสอบ</w:t>
+        <w:br/>
+        <w:t xml:space="preserve">  • ประวัติการคืนแล้ว: จำนวนรายการที่ส่งคืนครุภัณฑ์ครบถ้วนและตรวจรับสภาพเรียบร้อยสมบูรณ์</w:t>
+        <w:br/>
+        <w:t xml:space="preserve">  • ชั่วโมงฝึกด้วยตนเอง: ชั่วโมงฝึกสะสมจากการจองห้องซ้อมนอกเวลา พร้อมปุ่มกดจองรอบเข้าฝึกได้ทันที</w:t>
+      </w:r>
+    </w:p>
+    <w:p>
+      <w:pPr>
+        <w:spacing w:after="120"/>
+      </w:pPr>
+      <w:r>
+        <w:rPr>
+          <w:rFonts w:ascii="TH Sarabun PSK" w:hAnsi="TH Sarabun PSK" w:cs="TH Sarabun PSK"/>
+          <w:b/>
+          <w:i w:val="0"/>
+          <w:color w:val="0F766E"/>
+          <w:sz w:val="32"/>
+        </w:rPr>
+        <w:t>• จุดที่ 3: แถบติดตามกำหนดวันส่งคืน (Return Due Date Tracking &amp; Alerts)</w:t>
+        <w:br/>
+      </w:r>
+      <w:r>
+        <w:rPr>
+          <w:rFonts w:ascii="TH Sarabun PSK" w:hAnsi="TH Sarabun PSK" w:cs="TH Sarabun PSK"/>
+          <w:b w:val="0"/>
+          <w:i w:val="0"/>
+          <w:sz w:val="32"/>
+        </w:rPr>
+        <w:t>ระบบจะคำนวณวันคงเหลือจากกำหนดวันคืนจริงแบบอัตโนมัติ โดยแสดงแถบสีแจ้งเตือนอย่างชัดเจน เช่น แถบสีฟ้า (เหลือเวลาอีก 2 วัน), แถบสีเหลือง (ครบกำหนดวันนี้), หรือแถบสีแดงกระพริบเตือน (เกินกำหนดส่งคืน) เพื่อให้นิสิตไม่พลาดกำหนดเวลาส่งคืนครุภัณฑ์</w:t>
+      </w:r>
+    </w:p>
+    <w:p>
+      <w:pPr>
+        <w:spacing w:after="120"/>
+      </w:pPr>
+      <w:r>
+        <w:rPr>
+          <w:rFonts w:ascii="TH Sarabun PSK" w:hAnsi="TH Sarabun PSK" w:cs="TH Sarabun PSK"/>
+          <w:b/>
+          <w:i w:val="0"/>
+          <w:color w:val="0F766E"/>
+          <w:sz w:val="32"/>
+        </w:rPr>
+        <w:t>• จุดที่ 4: การ์ดรายการอุปกรณ์ที่ถือครอง (Active Loan Items)</w:t>
+        <w:br/>
+      </w:r>
+      <w:r>
+        <w:rPr>
+          <w:rFonts w:ascii="TH Sarabun PSK" w:hAnsi="TH Sarabun PSK" w:cs="TH Sarabun PSK"/>
+          <w:b w:val="0"/>
+          <w:i w:val="0"/>
+          <w:sz w:val="32"/>
+        </w:rPr>
+        <w:t>แสดงรายการคำขอที่กำลังยืมอยู่ เช่น รหัส BR-2026-0038 รายวิชา NS201 พร้อมรายชื่ออุปกรณ์การแพทย์ (เช่น หุ่นฝึกสวนปัสสาวะ, หูฟัง Littmann Classic III) และวัน-เวลาที่ต้องนำส่งคืนห้องปฏิบัติการ</w:t>
+      </w:r>
+    </w:p>
+    <w:p>
+      <w:r>
+        <w:br w:type="page"/>
+      </w:r>
+    </w:p>
+    <w:p>
+      <w:r>
+        <w:rPr>
+          <w:rFonts w:ascii="TH Sarabun PSK" w:hAnsi="TH Sarabun PSK" w:cs="TH Sarabun PSK"/>
+          <w:b/>
+          <w:i w:val="0"/>
+          <w:color w:val="0F766E"/>
+          <w:sz w:val="40"/>
+        </w:rPr>
+        <w:t>บทที่ 4: ภาพรวมรายการคำขอและขั้นตอนการยืม-เบิก One-Stop (ภาพจากระบบจริง)</w:t>
+      </w:r>
+    </w:p>
+    <w:p>
+      <w:r>
+        <w:rPr>
+          <w:rFonts w:ascii="TH Sarabun PSK" w:hAnsi="TH Sarabun PSK" w:cs="TH Sarabun PSK"/>
+          <w:b w:val="0"/>
+          <w:i w:val="0"/>
+          <w:sz w:val="32"/>
+        </w:rPr>
+        <w:t>เมื่อนิสิตเข้าสู่เมนู 'ยืม-คืนอุปกรณ์' ระบบจะแสดงหน้าจอภาพรวม (Overview Dashboard) แสดงรายการประวัติคำขอของนิสิตพร้อมสถานะแบบเรียลไทม์ ดังแสดงในรูปที่ 4.1:</w:t>
+      </w:r>
+    </w:p>
+    <w:p>
+      <w:r>
+        <w:drawing>
+          <wp:inline xmlns:a="http://schemas.openxmlformats.org/drawingml/2006/main" xmlns:pic="http://schemas.openxmlformats.org/drawingml/2006/picture">
+            <wp:extent cx="5303520" cy="4419600"/>
+            <wp:docPr id="6" name="Picture 6"/>
+            <wp:cNvGraphicFramePr>
+              <a:graphicFrameLocks noChangeAspect="1"/>
+            </wp:cNvGraphicFramePr>
+            <a:graphic>
+              <a:graphicData uri="http://schemas.openxmlformats.org/drawingml/2006/picture">
+                <pic:pic>
+                  <pic:nvPicPr>
+                    <pic:cNvPr id="0" name="overview_student_dashboard_annotated.png"/>
+                    <pic:cNvPicPr/>
+                  </pic:nvPicPr>
+                  <pic:blipFill>
+                    <a:blip r:embed="rId14"/>
+                    <a:stretch>
+                      <a:fillRect/>
+                    </a:stretch>
+                  </pic:blipFill>
+                  <pic:spPr>
+                    <a:xfrm>
+                      <a:off x="0" y="0"/>
+                      <a:ext cx="5303520" cy="4419600"/>
+                    </a:xfrm>
+                    <a:prstGeom prst="rect"/>
+                  </pic:spPr>
+                </pic:pic>
+              </a:graphicData>
+            </a:graphic>
+          </wp:inline>
+        </w:drawing>
+      </w:r>
+    </w:p>
+    <w:p>
+      <w:pPr>
+        <w:jc w:val="center"/>
+      </w:pPr>
+      <w:r>
+        <w:rPr>
+          <w:rFonts w:ascii="TH Sarabun PSK" w:hAnsi="TH Sarabun PSK" w:cs="TH Sarabun PSK"/>
+          <w:b w:val="0"/>
+          <w:i/>
+          <w:color w:val="64748B"/>
+          <w:sz w:val="28"/>
+        </w:rPr>
+        <w:t>รูปที่ 4.1: ภาพจากระบบจริง - ภาพรวมรายการคำขอยืม-คืนของนิสิต (Overview Dashboard พร้อมข้อมูลคำขอจริงและปุ่ม One-Stop)</w:t>
       </w:r>
     </w:p>
     <w:p/>
@@ -1434,7 +1655,7 @@
           <w:i w:val="0"/>
           <w:sz w:val="32"/>
         </w:rPr>
-        <w:t>เมื่อต้องการยืม-เบิกอุปกรณ์ ให้กดปุ่ม '+ ขอยืม-เบิกอุปกรณ์ (One-Stop)' ที่มุมขวาบนของหน้าจอ ระบบจะเปิดหน้าต่างฟอร์มรวม ดังแสดงในรูปที่ 3.2 ให้นิสิตกรอกข้อมูลตามหมายเลขกำกับจุดที่ 1 ถึง 7:</w:t>
+        <w:t>เมื่อต้องการยืม-เบิกอุปกรณ์ ให้กดปุ่ม '+ ขอยืม-เบิกอุปกรณ์ (One-Stop)' ที่มุมขวาบนของหน้าจอ ระบบจะเปิดหน้าต่างฟอร์มรวม ดังแสดงในรูปที่ 4.2 ให้นิสิตกรอกข้อมูลตามหมายเลขกำกับจุดที่ 1 ถึง 7:</w:t>
       </w:r>
     </w:p>
     <w:p>
@@ -1442,7 +1663,7 @@
         <w:drawing>
           <wp:inline xmlns:a="http://schemas.openxmlformats.org/drawingml/2006/main" xmlns:pic="http://schemas.openxmlformats.org/drawingml/2006/picture">
             <wp:extent cx="5303520" cy="4051300"/>
-            <wp:docPr id="6" name="Picture 6"/>
+            <wp:docPr id="7" name="Picture 7"/>
             <wp:cNvGraphicFramePr>
               <a:graphicFrameLocks noChangeAspect="1"/>
             </wp:cNvGraphicFramePr>
@@ -1454,7 +1675,7 @@
                     <pic:cNvPicPr/>
                   </pic:nvPicPr>
                   <pic:blipFill>
-                    <a:blip r:embed="rId14"/>
+                    <a:blip r:embed="rId15"/>
                     <a:stretch>
                       <a:fillRect/>
                     </a:stretch>
@@ -1485,7 +1706,7 @@
           <w:color w:val="64748B"/>
           <w:sz w:val="28"/>
         </w:rPr>
-        <w:t>รูปที่ 3.2: ภาพจากระบบจริง - ชี้ตำแหน่งและสิ่งที่ต้องกรอกในแต่ละช่อง (จุดที่ 1 ถึง 7)</w:t>
+        <w:t>รูปที่ 4.2: ภาพจากระบบจริง - ชี้ตำแหน่งและสิ่งที่ต้องกรอกในแต่ละช่อง (จุดที่ 1 ถึง 7)</w:t>
       </w:r>
     </w:p>
     <w:p/>
@@ -1696,7 +1917,7 @@
           <w:color w:val="0F766E"/>
           <w:sz w:val="40"/>
         </w:rPr>
-        <w:t>บทที่ 4: การขอเบิกชุดฝึกปฏิบัติการสำเร็จรูป (Nursing Practice Kits)</w:t>
+        <w:t>บทที่ 5: การขอเบิกชุดฝึกปฏิบัติการสำเร็จรูป (Nursing Practice Kits)</w:t>
       </w:r>
     </w:p>
     <w:p>
@@ -1715,7 +1936,7 @@
         <w:drawing>
           <wp:inline xmlns:a="http://schemas.openxmlformats.org/drawingml/2006/main" xmlns:pic="http://schemas.openxmlformats.org/drawingml/2006/picture">
             <wp:extent cx="5303520" cy="4051300"/>
-            <wp:docPr id="7" name="Picture 7"/>
+            <wp:docPr id="8" name="Picture 8"/>
             <wp:cNvGraphicFramePr>
               <a:graphicFrameLocks noChangeAspect="1"/>
             </wp:cNvGraphicFramePr>
@@ -1727,7 +1948,7 @@
                     <pic:cNvPicPr/>
                   </pic:nvPicPr>
                   <pic:blipFill>
-                    <a:blip r:embed="rId15"/>
+                    <a:blip r:embed="rId16"/>
                     <a:stretch>
                       <a:fillRect/>
                     </a:stretch>
@@ -1758,7 +1979,7 @@
           <w:color w:val="64748B"/>
           <w:sz w:val="28"/>
         </w:rPr>
-        <w:t>รูปที่ 4.1: ภาพจากระบบจริง - หน้ารายการชุดฝึกสำเร็จรูป พร้อมขั้นตอน 1-2</w:t>
+        <w:t>รูปที่ 5.1: ภาพจากระบบจริง - หน้ารายการชุดฝึกสำเร็จรูป พร้อมขั้นตอน 1-2</w:t>
       </w:r>
     </w:p>
     <w:p>
@@ -1823,7 +2044,7 @@
           <w:color w:val="0F766E"/>
           <w:sz w:val="40"/>
         </w:rPr>
-        <w:t>บทที่ 5: การขอเข้าฝึกปฏิบัติการด้วยตนเองและการ Check-in</w:t>
+        <w:t>บทที่ 6: การขอเข้าฝึกปฏิบัติการด้วยตนเองและการ Check-in</w:t>
       </w:r>
     </w:p>
     <w:p>
@@ -1842,7 +2063,7 @@
         <w:drawing>
           <wp:inline xmlns:a="http://schemas.openxmlformats.org/drawingml/2006/main" xmlns:pic="http://schemas.openxmlformats.org/drawingml/2006/picture">
             <wp:extent cx="5303520" cy="4051300"/>
-            <wp:docPr id="8" name="Picture 8"/>
+            <wp:docPr id="9" name="Picture 9"/>
             <wp:cNvGraphicFramePr>
               <a:graphicFrameLocks noChangeAspect="1"/>
             </wp:cNvGraphicFramePr>
@@ -1854,7 +2075,7 @@
                     <pic:cNvPicPr/>
                   </pic:nvPicPr>
                   <pic:blipFill>
-                    <a:blip r:embed="rId16"/>
+                    <a:blip r:embed="rId17"/>
                     <a:stretch>
                       <a:fillRect/>
                     </a:stretch>
@@ -1885,7 +2106,7 @@
           <w:color w:val="64748B"/>
           <w:sz w:val="28"/>
         </w:rPr>
-        <w:t>รูปที่ 5.1: ภาพจากระบบจริง - หน้าจองห้องปฏิบัติการและรอบเวลา (Time Slots)</w:t>
+        <w:t>รูปที่ 6.1: ภาพจากระบบจริง - หน้าจองห้องปฏิบัติการและรอบเวลา (Time Slots)</w:t>
       </w:r>
     </w:p>
     <w:p>
@@ -1893,7 +2114,7 @@
         <w:drawing>
           <wp:inline xmlns:a="http://schemas.openxmlformats.org/drawingml/2006/main" xmlns:pic="http://schemas.openxmlformats.org/drawingml/2006/picture">
             <wp:extent cx="3474720" cy="4169664"/>
-            <wp:docPr id="9" name="Picture 9"/>
+            <wp:docPr id="10" name="Picture 10"/>
             <wp:cNvGraphicFramePr>
               <a:graphicFrameLocks noChangeAspect="1"/>
             </wp:cNvGraphicFramePr>
@@ -1905,7 +2126,7 @@
                     <pic:cNvPicPr/>
                   </pic:nvPicPr>
                   <pic:blipFill>
-                    <a:blip r:embed="rId17"/>
+                    <a:blip r:embed="rId18"/>
                     <a:stretch>
                       <a:fillRect/>
                     </a:stretch>
@@ -1936,7 +2157,7 @@
           <w:color w:val="64748B"/>
           <w:sz w:val="28"/>
         </w:rPr>
-        <w:t>รูปที่ 5.2: บัตรเข้าห้องปฏิบัติการ Digital E-Ticket พร้อม QR Code สำหรับสแกน Check-in</w:t>
+        <w:t>รูปที่ 6.2: บัตรเข้าห้องปฏิบัติการ Digital E-Ticket พร้อม QR Code สำหรับสแกน Check-in</w:t>
       </w:r>
     </w:p>
     <w:p>
@@ -2049,7 +2270,7 @@
           <w:color w:val="0F766E"/>
           <w:sz w:val="40"/>
         </w:rPr>
-        <w:t>บทที่ 6: การส่งคืนอุปกรณ์และข้อพึงระวังความปลอดภัย</w:t>
+        <w:t>บทที่ 7: การส่งคืนอุปกรณ์และข้อพึงระวังความปลอดภัย</w:t>
       </w:r>
     </w:p>
     <w:tbl>

</xml_diff>